<commit_message>
Pair note v2: verified HKEX short-sell + SZSE Southbound lists and the August prints; memory pairs re-cut (long GigaDevice), Gpixel pair dropped, calendar fixed
Co-Authored-By: Claude Fable 5.1 <noreply@anthropic.com>
</commit_message>
<xml_diff>
--- a/HK_Semi_Pair_Trades_Sep2026.docx
+++ b/HK_Semi_Pair_Trades_Sep2026.docx
@@ -17,7 +17,7 @@
           <w:color w:val="595959"/>
           <w:sz w:val="19"/>
         </w:rPr>
-        <w:t>Written 8 Sep 2026 · prices = 7 Sep 2026 HKEX close (Tencent/HKEX prints), A-shares SSE/SZSE close, CNYHKD 1.1674 · ratios are H-share price ratios unless marked A · trader audience, internal</w:t>
+        <w:t>Written 8–9 Sep 2026 · prices = 7 Sep 2026 HKEX close, A-shares SSE/SZSE close, CNYHKD 1.1674 · short-sell and Southbound status verified against the HKEX designated list (effective 11 Sep) and the SZSE Southbound list (9 Sep) · 1H26 prints from company results headlines · trader audience, internal</w:t>
       </w:r>
     </w:p>
     <w:p>
@@ -28,7 +28,7 @@
         <w:rPr>
           <w:i w:val="0"/>
         </w:rPr>
-        <w:t>Short version. The HK semi complex topped 25–30 June and is 20–60% off the highs while HSTECH is +3% over the same window, so this was a sector unwind (A-share crowd rotating out, IPO supply, July–August lock-up expiries), not a market fall. That leaves a lot of dispersion inside the group, which is where the pairs are. Four I would actually put on, three to watch:</w:t>
+        <w:t>Short version. The HK semi complex topped 25–30 June and is 20–60% off the highs while HSTECH is +3% over the same window — a sector unwind (bond-yield selloff in global chips, A-share crowd rotating out, IPO supply, July–August lock-up expiries), not a market fall. The interim prints that landed in August are extreme in both directions, which is what makes the pairs. Four I would put on, three to watch:</w:t>
       </w:r>
     </w:p>
     <w:p>
@@ -40,10 +40,10 @@
         <w:rPr>
           <w:b/>
         </w:rPr>
-        <w:t xml:space="preserve">Long Nexchip 2249 / short GigaDevice 3986. </w:t>
+        <w:t xml:space="preserve">The pair you asked about, Nexchip vs GigaDevice, is right in one direction only — long GigaDevice / short Nexchip. </w:t>
       </w:r>
       <w:r>
-        <w:t>The tradeable direction of the pair you asked about — Nexchip is not shortable yet. H at a 53% discount to its A with Southbound inclusion ahead, against a memory name whose H trades ABOVE its A on 190x trailing.</w:t>
+        <w:t>1H26 net profit +10.9x vs −26%; 22x vs 107x on annualised earnings. The catch: Nexchip is not on the HKEX short-sell list (checked 1, 10 and 11 Sep) and the quarterly review just passed, so the earliest borrow is the December review — three weeks before its 10 Jan 2027 cornerstone unlock. Do not take the reverse just because the H is 53% below the A: Southbound already has access and the profits are falling. Interim expression: long GigaDevice hedged with SMIC.</w:t>
       </w:r>
     </w:p>
     <w:p>
@@ -55,10 +55,10 @@
         <w:rPr>
           <w:b/>
         </w:rPr>
-        <w:t xml:space="preserve">Long Montage 6809 / short GigaDevice 3986. </w:t>
+        <w:t xml:space="preserve">Long GigaDevice 3986 / short Montage 6809 into the Q4 contract print. </w:t>
       </w:r>
       <w:r>
-        <w:t>The cleanest memory pair: content growth (DDR5/MRDIMM/retimers) vs commodity price (DDR4/NOR). Ratio at a 2-year low on the A-shares, 0.82 correlation, both liquid and shortable.</w:t>
+        <w:t>The ratio z-score screams the opposite and it is a trap — relative EPS moved 6x, the price ratio 0.8x. 22x vs 73x annualised, both H-above-A Southbound names, 0.82 correlation. Flip it if TrendForce’s Q4 outlook (late Sep) is flat.</w:t>
       </w:r>
     </w:p>
     <w:p>
@@ -73,7 +73,7 @@
         <w:t xml:space="preserve">Long SMIC 981 / short Hua Hong 1347. </w:t>
       </w:r>
       <w:r>
-        <w:t>Hua Hong/SMIC ratio still at the 88th–91st percentile of two years after a 30% give-back; 468x trailing vs 110x. Enter on a bounce, not here.</w:t>
+        <w:t>55x vs 215x annualised; Hua Hong/SMIC still at the 88th–91st percentile of two years after a 30% give-back. Hua Hong beat in Q2 and guided up, so enter on a bounce, not here.</w:t>
       </w:r>
     </w:p>
     <w:p>
@@ -88,7 +88,7 @@
         <w:t xml:space="preserve">Long Innoscience 2577 / short SICC 2631. </w:t>
       </w:r>
       <w:r>
-        <w:t>GaN adoption curve vs SiC substrate price war; ratio 0.67 vs a one-year mean of 1.03.</w:t>
+        <w:t>The August prints confirm the direction: Innoscience revenue +51% with gross margin +4.8pts; SICC revenue +15% with a swing to loss. Ratio 0.67 vs a one-year mean of 1.03.</w:t>
       </w:r>
     </w:p>
     <w:p>
@@ -103,7 +103,7 @@
         <w:t xml:space="preserve">Watch: </w:t>
       </w:r>
       <w:r>
-        <w:t>Horizon/Black Sesame (quality, but 0.35 correlation and thin borrow), Iluvatar/Biren (ratio at a 40-day extreme after Iluvatar’s −11% Monday — find the cause first), OmniVision/Gpixel (20x vs 115x, but the long leg trades HK$30m a day).</w:t>
+        <w:t>Iluvatar/Biren (ratio at a 40-day extreme after Iluvatar’s −11% Monday, gross margin 50→17% in 1H, four brokers still 2–3x above the price), Horizon/Black Sesame (both shortable, thin borrow, 0.35 correlation), OmniVision/Gpixel (dead — Gpixel is not designated).</w:t>
       </w:r>
     </w:p>
     <w:p>
@@ -115,7 +115,7 @@
           <w:i w:val="0"/>
           <w:sz w:val="20"/>
         </w:rPr>
-        <w:t>Two housekeeping points before the detail. (a) Pairs 1 and 2 share the same short; run one, or halve both and swap SMIC in as the short leg of pair 1. (b) Spread vols in this group are 45–90% annualised — a 20% ratio move inside three months is roughly a half-sigma event, so the edge in every one of these is the catalyst sequence and the structural set-up, not the z-score. Size accordingly (half normal) and stop on the spread, never on a leg.</w:t>
+        <w:t>Housekeeping. (a) Pairs 1 and 2 are both long GigaDevice; the book’s net long in one 100%-vol name should not exceed one pair’s worth — run pair 2 and use pair 1 as the December set-up. (b) Spread vols here are 45–90% annualised: a 20% ratio move in three months is a half-sigma event, so the edge is the print calendar and the structural set-up, not the z-score. Size at half normal and stop on the spread, never on a leg.</w:t>
       </w:r>
     </w:p>
     <w:p>
@@ -138,7 +138,7 @@
         <w:t xml:space="preserve">The top was 25–30 June. </w:t>
       </w:r>
       <w:r>
-        <w:t>GigaDevice 1,241 (29 Jun) → 492 now, Hua Hong 215 → 115, Iluvatar 793 → 340, Montage 501 (13 May) → 279, ASMPT 239 → 168. SMIC only −20% from its October-2025 high — the big liquid name held, the 2026 IPO cohort did not.</w:t>
+        <w:t>GigaDevice 1,241 (29 Jun) → 492, Hua Hong 215 → 115, Iluvatar 793 → 340, Montage 501 (13 May) → 279, ASMPT 239 → 168. SMIC is only −20% from its October-2025 high — the big liquid name held, the 2026 IPO cohort did not.</w:t>
       </w:r>
     </w:p>
     <w:p>
@@ -153,7 +153,22 @@
         <w:t xml:space="preserve">Supply explains the timing. </w:t>
       </w:r>
       <w:r>
-        <w:t>The January–February H-listings all came out of their six-month cornerstone lock-ups between 2 Jul (Biren) and 10 Aug (Axera): Iluvatar 8 Jul, OmniVision 12 Jul, GigaDevice 13 Jul, Montage 9 Aug. On top of that: Nexchip listed 10 Jul, Innolight 30 Jul, Ingenic 25 Aug. Free float in the sector roughly doubled in eight weeks.</w:t>
+        <w:t>The January–February H-listings came out of their six-month cornerstone lock-ups between 2 Jul (Biren) and 10 Aug (Axera): Iluvatar 8 Jul, OmniVision 12 Jul, GigaDevice 13 Jul, Montage 9 Aug. Then Nexchip listed 10 Jul, Innolight 30 Jul, Ingenic 25 Aug. Free float in the sector roughly doubled in eight weeks, into a global chip selloff on rising bond yields (Samsung and Hynix −6% days).</w:t>
+      </w:r>
+    </w:p>
+    <w:p>
+      <w:pPr>
+        <w:pStyle w:val="ListBullet"/>
+        <w:spacing w:after="40"/>
+      </w:pPr>
+      <w:r>
+        <w:rPr>
+          <w:b/>
+        </w:rPr>
+        <w:t xml:space="preserve">The prints went the other way. </w:t>
+      </w:r>
+      <w:r>
+        <w:t>1H26 net profit: GigaDevice +10.9x, Hua Hong +409%, SMIC +111%, Montage +72%, Iluvatar to profit; Nexchip −26%, SICC to loss. The memory cycle is still running: TrendForce has 2Q26 DRAM industry revenue +59.5% QoQ to US$154.7bn, supplier inventories at historic lows, and 3Q26 conventional DRAM contract prices +13–18% QoQ — still up, but decelerating from Q2. That deceleration is what the −60% in GigaDevice is pricing.</w:t>
       </w:r>
     </w:p>
     <w:p>
@@ -168,7 +183,7 @@
         <w:t xml:space="preserve">A/H tells you who owns what. </w:t>
       </w:r>
       <w:r>
-        <w:t>Memory names trade with the H ABOVE the A — GigaDevice H at an 8.5% premium to its A, Montage 17%, Innolight 13% — which only happens when Southbound plus offshore money is crowding into an H float that is a fraction of the A float (GigaDevice H float HK$16bn vs A HK$300bn). Foundries are the opposite: SMIC H at a 112% A-premium, Hua Hong 127%, Nexchip 53% (was 96% on debut, 35% at the 14-Aug low).</w:t>
+        <w:t>Memory names trade with the H ABOVE the A — GigaDevice 8.5%, Montage 17%, Innolight 13% — which only happens when Southbound plus offshore money crowd an H float that is a fraction of the A float (GigaDevice H float HK$16bn vs A HK$270bn). Foundries are the opposite: SMIC H at a 112% A-premium, Hua Hong 127%, Nexchip 53% (96% on debut, 35% at the 14-Aug low). Southbound has been a net seller of SMIC for six straight sessions to 8 Sep and of Hua Hong alongside.</w:t>
       </w:r>
     </w:p>
     <w:p>
@@ -183,7 +198,7 @@
         <w:t xml:space="preserve">Monday 7 Sep was index day. </w:t>
       </w:r>
       <w:r>
-        <w:t>The Hang Seng quarterly review took effect (Monday after the first Friday of September) and the tape looked like it: Innolight +19.6%, CFMEE +12.9%, Montage +6.7%, GigaDevice +5.8% against Iluvatar −11.4%, Axera −12.5%, FourSemi −18%, Gpixel −8%. Treat Monday’s closes as flow-distorted when you set entry levels — check the constituent changes on hsi.com.hk before trusting any single-day ratio.</w:t>
+        <w:t>The Hang Seng quarterly review took effect (Monday after the first Friday of September) and the tape looked like it: Innolight +19.6%, CFMEE +12.9%, Montage +6.7%, GigaDevice +5.8% against Iluvatar −11.4%, Axera −12.5%, FourSemi −18%, Gpixel −8%. Treat Monday’s closes as flow-distorted when setting entries.</w:t>
       </w:r>
     </w:p>
     <w:p>
@@ -388,7 +403,7 @@
                 <w:color w:val="FFFFFF"/>
                 <w:sz w:val="16"/>
               </w:rPr>
-              <w:t>P/E trail</w:t>
+              <w:t>P/E feed</w:t>
             </w:r>
           </w:p>
         </w:tc>
@@ -4683,7 +4698,7 @@
           <w:color w:val="595959"/>
           <w:sz w:val="17"/>
         </w:rPr>
-        <w:t>P/E is the trailing multiple on the quote feed (“loss” = negative earnings). A-prem = A-share price in HKD over H price, minus one; negative means the H is the more expensive line. H float = H-share market cap (what is actually tradeable/lendable in HK). vs IPO shown for 2025–26 listings only.</w:t>
+        <w:t>“P/E feed” is the trailing multiple on the quote feed — it still uses FY25 earnings and is badly stale for the names whose profits stepped up in 1H26 (next table). A-prem = A-share price in HKD over H price, minus one; negative = the H is the expensive line. H float = H-share market cap. vs IPO shown for 2025–26 listings only.</w:t>
       </w:r>
     </w:p>
     <w:p>
@@ -4691,7 +4706,924 @@
         <w:pStyle w:val="Heading2"/>
       </w:pPr>
       <w:r>
-        <w:t>Plumbing — what you can and cannot short</w:t>
+        <w:t>Valuation on the August prints (annualised 1H26)</w:t>
+      </w:r>
+    </w:p>
+    <w:tbl>
+      <w:tblPr>
+        <w:tblStyle w:val="TableGrid"/>
+        <w:tblW w:type="auto" w:w="0"/>
+        <w:jc w:val="center"/>
+        <w:tblLook w:firstColumn="1" w:firstRow="1" w:lastColumn="0" w:lastRow="0" w:noHBand="0" w:noVBand="1" w:val="04A0"/>
+      </w:tblPr>
+      <w:tblGrid>
+        <w:gridCol w:w="1425"/>
+        <w:gridCol w:w="1425"/>
+        <w:gridCol w:w="1425"/>
+        <w:gridCol w:w="1425"/>
+        <w:gridCol w:w="1425"/>
+        <w:gridCol w:w="1425"/>
+        <w:gridCol w:w="1425"/>
+      </w:tblGrid>
+      <w:tr>
+        <w:tc>
+          <w:tcPr>
+            <w:tcW w:type="dxa" w:w="1928"/>
+            <w:shd w:val="clear" w:color="auto" w:fill="1F3A5F"/>
+          </w:tcPr>
+          <w:p>
+            <w:r/>
+            <w:r>
+              <w:rPr>
+                <w:b/>
+                <w:color w:val="FFFFFF"/>
+                <w:sz w:val="16"/>
+              </w:rPr>
+              <w:t>Name</w:t>
+            </w:r>
+          </w:p>
+        </w:tc>
+        <w:tc>
+          <w:tcPr>
+            <w:tcW w:type="dxa" w:w="1020"/>
+            <w:shd w:val="clear" w:color="auto" w:fill="1F3A5F"/>
+          </w:tcPr>
+          <w:p>
+            <w:pPr>
+              <w:jc w:val="right"/>
+            </w:pPr>
+            <w:r/>
+            <w:r>
+              <w:rPr>
+                <w:b/>
+                <w:color w:val="FFFFFF"/>
+                <w:sz w:val="16"/>
+              </w:rPr>
+              <w:t>Mkt cap HK$bn</w:t>
+            </w:r>
+          </w:p>
+        </w:tc>
+        <w:tc>
+          <w:tcPr>
+            <w:tcW w:type="dxa" w:w="1247"/>
+            <w:shd w:val="clear" w:color="auto" w:fill="1F3A5F"/>
+          </w:tcPr>
+          <w:p>
+            <w:pPr>
+              <w:jc w:val="right"/>
+            </w:pPr>
+            <w:r/>
+            <w:r>
+              <w:rPr>
+                <w:b/>
+                <w:color w:val="FFFFFF"/>
+                <w:sz w:val="16"/>
+              </w:rPr>
+              <w:t>1H26 net profit</w:t>
+            </w:r>
+          </w:p>
+        </w:tc>
+        <w:tc>
+          <w:tcPr>
+            <w:tcW w:type="dxa" w:w="737"/>
+            <w:shd w:val="clear" w:color="auto" w:fill="1F3A5F"/>
+          </w:tcPr>
+          <w:p>
+            <w:pPr>
+              <w:jc w:val="right"/>
+            </w:pPr>
+            <w:r/>
+            <w:r>
+              <w:rPr>
+                <w:b/>
+                <w:color w:val="FFFFFF"/>
+                <w:sz w:val="16"/>
+              </w:rPr>
+              <w:t>YoY</w:t>
+            </w:r>
+          </w:p>
+        </w:tc>
+        <w:tc>
+          <w:tcPr>
+            <w:tcW w:type="dxa" w:w="1077"/>
+            <w:shd w:val="clear" w:color="auto" w:fill="1F3A5F"/>
+          </w:tcPr>
+          <w:p>
+            <w:pPr>
+              <w:jc w:val="right"/>
+            </w:pPr>
+            <w:r/>
+            <w:r>
+              <w:rPr>
+                <w:b/>
+                <w:color w:val="FFFFFF"/>
+                <w:sz w:val="16"/>
+              </w:rPr>
+              <w:t>P/E on 2×1H26</w:t>
+            </w:r>
+          </w:p>
+        </w:tc>
+        <w:tc>
+          <w:tcPr>
+            <w:tcW w:type="dxa" w:w="794"/>
+            <w:shd w:val="clear" w:color="auto" w:fill="1F3A5F"/>
+          </w:tcPr>
+          <w:p>
+            <w:pPr>
+              <w:jc w:val="right"/>
+            </w:pPr>
+            <w:r/>
+            <w:r>
+              <w:rPr>
+                <w:b/>
+                <w:color w:val="FFFFFF"/>
+                <w:sz w:val="16"/>
+              </w:rPr>
+              <w:t>P/E feed</w:t>
+            </w:r>
+          </w:p>
+        </w:tc>
+        <w:tc>
+          <w:tcPr>
+            <w:tcW w:type="dxa" w:w="2948"/>
+            <w:shd w:val="clear" w:color="auto" w:fill="1F3A5F"/>
+          </w:tcPr>
+          <w:p>
+            <w:pPr>
+              <w:jc w:val="right"/>
+            </w:pPr>
+            <w:r/>
+            <w:r>
+              <w:rPr>
+                <w:b/>
+                <w:color w:val="FFFFFF"/>
+                <w:sz w:val="16"/>
+              </w:rPr>
+              <w:t>Print</w:t>
+            </w:r>
+          </w:p>
+        </w:tc>
+      </w:tr>
+      <w:tr>
+        <w:tc>
+          <w:tcPr>
+            <w:tcW w:type="dxa" w:w="1928"/>
+          </w:tcPr>
+          <w:p>
+            <w:r/>
+            <w:r>
+              <w:rPr>
+                <w:b/>
+                <w:sz w:val="16"/>
+              </w:rPr>
+              <w:t>3986 GigaDevice 兆易</w:t>
+            </w:r>
+          </w:p>
+        </w:tc>
+        <w:tc>
+          <w:tcPr>
+            <w:tcW w:type="dxa" w:w="1020"/>
+          </w:tcPr>
+          <w:p>
+            <w:pPr>
+              <w:jc w:val="right"/>
+            </w:pPr>
+            <w:r/>
+            <w:r>
+              <w:rPr>
+                <w:sz w:val="16"/>
+              </w:rPr>
+              <w:t>346</w:t>
+            </w:r>
+          </w:p>
+        </w:tc>
+        <w:tc>
+          <w:tcPr>
+            <w:tcW w:type="dxa" w:w="1247"/>
+          </w:tcPr>
+          <w:p>
+            <w:pPr>
+              <w:jc w:val="right"/>
+            </w:pPr>
+            <w:r/>
+            <w:r>
+              <w:rPr>
+                <w:sz w:val="16"/>
+              </w:rPr>
+              <w:t>RMB 6,857m</w:t>
+            </w:r>
+          </w:p>
+        </w:tc>
+        <w:tc>
+          <w:tcPr>
+            <w:tcW w:type="dxa" w:w="737"/>
+          </w:tcPr>
+          <w:p>
+            <w:pPr>
+              <w:jc w:val="right"/>
+            </w:pPr>
+            <w:r/>
+            <w:r>
+              <w:rPr>
+                <w:sz w:val="16"/>
+              </w:rPr>
+              <w:t>+10.9x</w:t>
+            </w:r>
+          </w:p>
+        </w:tc>
+        <w:tc>
+          <w:tcPr>
+            <w:tcW w:type="dxa" w:w="1077"/>
+          </w:tcPr>
+          <w:p>
+            <w:pPr>
+              <w:jc w:val="right"/>
+            </w:pPr>
+            <w:r/>
+            <w:r>
+              <w:rPr>
+                <w:sz w:val="16"/>
+              </w:rPr>
+              <w:t>22x</w:t>
+            </w:r>
+          </w:p>
+        </w:tc>
+        <w:tc>
+          <w:tcPr>
+            <w:tcW w:type="dxa" w:w="794"/>
+          </w:tcPr>
+          <w:p>
+            <w:pPr>
+              <w:jc w:val="right"/>
+            </w:pPr>
+            <w:r/>
+            <w:r>
+              <w:rPr>
+                <w:sz w:val="16"/>
+              </w:rPr>
+              <w:t>190x</w:t>
+            </w:r>
+          </w:p>
+        </w:tc>
+        <w:tc>
+          <w:tcPr>
+            <w:tcW w:type="dxa" w:w="2948"/>
+          </w:tcPr>
+          <w:p>
+            <w:pPr>
+              <w:jc w:val="right"/>
+            </w:pPr>
+            <w:r/>
+            <w:r>
+              <w:rPr>
+                <w:sz w:val="16"/>
+              </w:rPr>
+              <w:t>net profit RMB6.857bn</w:t>
+            </w:r>
+          </w:p>
+        </w:tc>
+      </w:tr>
+      <w:tr>
+        <w:tc>
+          <w:tcPr>
+            <w:tcW w:type="dxa" w:w="1928"/>
+            <w:shd w:val="clear" w:color="auto" w:fill="F2F5F9"/>
+          </w:tcPr>
+          <w:p>
+            <w:r/>
+            <w:r>
+              <w:rPr>
+                <w:b/>
+                <w:sz w:val="16"/>
+              </w:rPr>
+              <w:t>6809 Montage 澜起</w:t>
+            </w:r>
+          </w:p>
+        </w:tc>
+        <w:tc>
+          <w:tcPr>
+            <w:tcW w:type="dxa" w:w="1020"/>
+            <w:shd w:val="clear" w:color="auto" w:fill="F2F5F9"/>
+          </w:tcPr>
+          <w:p>
+            <w:pPr>
+              <w:jc w:val="right"/>
+            </w:pPr>
+            <w:r/>
+            <w:r>
+              <w:rPr>
+                <w:sz w:val="16"/>
+              </w:rPr>
+              <w:t>341</w:t>
+            </w:r>
+          </w:p>
+        </w:tc>
+        <w:tc>
+          <w:tcPr>
+            <w:tcW w:type="dxa" w:w="1247"/>
+            <w:shd w:val="clear" w:color="auto" w:fill="F2F5F9"/>
+          </w:tcPr>
+          <w:p>
+            <w:pPr>
+              <w:jc w:val="right"/>
+            </w:pPr>
+            <w:r/>
+            <w:r>
+              <w:rPr>
+                <w:sz w:val="16"/>
+              </w:rPr>
+              <w:t>RMB 1,997m</w:t>
+            </w:r>
+          </w:p>
+        </w:tc>
+        <w:tc>
+          <w:tcPr>
+            <w:tcW w:type="dxa" w:w="737"/>
+            <w:shd w:val="clear" w:color="auto" w:fill="F2F5F9"/>
+          </w:tcPr>
+          <w:p>
+            <w:pPr>
+              <w:jc w:val="right"/>
+            </w:pPr>
+            <w:r/>
+            <w:r>
+              <w:rPr>
+                <w:sz w:val="16"/>
+              </w:rPr>
+              <w:t>+72%</w:t>
+            </w:r>
+          </w:p>
+        </w:tc>
+        <w:tc>
+          <w:tcPr>
+            <w:tcW w:type="dxa" w:w="1077"/>
+            <w:shd w:val="clear" w:color="auto" w:fill="F2F5F9"/>
+          </w:tcPr>
+          <w:p>
+            <w:pPr>
+              <w:jc w:val="right"/>
+            </w:pPr>
+            <w:r/>
+            <w:r>
+              <w:rPr>
+                <w:sz w:val="16"/>
+              </w:rPr>
+              <w:t>73x</w:t>
+            </w:r>
+          </w:p>
+        </w:tc>
+        <w:tc>
+          <w:tcPr>
+            <w:tcW w:type="dxa" w:w="794"/>
+            <w:shd w:val="clear" w:color="auto" w:fill="F2F5F9"/>
+          </w:tcPr>
+          <w:p>
+            <w:pPr>
+              <w:jc w:val="right"/>
+            </w:pPr>
+            <w:r/>
+            <w:r>
+              <w:rPr>
+                <w:sz w:val="16"/>
+              </w:rPr>
+              <w:t>138x</w:t>
+            </w:r>
+          </w:p>
+        </w:tc>
+        <w:tc>
+          <w:tcPr>
+            <w:tcW w:type="dxa" w:w="2948"/>
+            <w:shd w:val="clear" w:color="auto" w:fill="F2F5F9"/>
+          </w:tcPr>
+          <w:p>
+            <w:pPr>
+              <w:jc w:val="right"/>
+            </w:pPr>
+            <w:r/>
+            <w:r>
+              <w:rPr>
+                <w:sz w:val="16"/>
+              </w:rPr>
+              <w:t>net profit RMB1.997bn, interim div RMB0.20/sh</w:t>
+            </w:r>
+          </w:p>
+        </w:tc>
+      </w:tr>
+      <w:tr>
+        <w:tc>
+          <w:tcPr>
+            <w:tcW w:type="dxa" w:w="1928"/>
+          </w:tcPr>
+          <w:p>
+            <w:r/>
+            <w:r>
+              <w:rPr>
+                <w:b/>
+                <w:sz w:val="16"/>
+              </w:rPr>
+              <w:t>2249 Nexchip 晶合</w:t>
+            </w:r>
+          </w:p>
+        </w:tc>
+        <w:tc>
+          <w:tcPr>
+            <w:tcW w:type="dxa" w:w="1020"/>
+          </w:tcPr>
+          <w:p>
+            <w:pPr>
+              <w:jc w:val="right"/>
+            </w:pPr>
+            <w:r/>
+            <w:r>
+              <w:rPr>
+                <w:sz w:val="16"/>
+              </w:rPr>
+              <w:t>61</w:t>
+            </w:r>
+          </w:p>
+        </w:tc>
+        <w:tc>
+          <w:tcPr>
+            <w:tcW w:type="dxa" w:w="1247"/>
+          </w:tcPr>
+          <w:p>
+            <w:pPr>
+              <w:jc w:val="right"/>
+            </w:pPr>
+            <w:r/>
+            <w:r>
+              <w:rPr>
+                <w:sz w:val="16"/>
+              </w:rPr>
+              <w:t>RMB 245m</w:t>
+            </w:r>
+          </w:p>
+        </w:tc>
+        <w:tc>
+          <w:tcPr>
+            <w:tcW w:type="dxa" w:w="737"/>
+          </w:tcPr>
+          <w:p>
+            <w:pPr>
+              <w:jc w:val="right"/>
+            </w:pPr>
+            <w:r/>
+            <w:r>
+              <w:rPr>
+                <w:sz w:val="16"/>
+              </w:rPr>
+              <w:t>−26%</w:t>
+            </w:r>
+          </w:p>
+        </w:tc>
+        <w:tc>
+          <w:tcPr>
+            <w:tcW w:type="dxa" w:w="1077"/>
+          </w:tcPr>
+          <w:p>
+            <w:pPr>
+              <w:jc w:val="right"/>
+            </w:pPr>
+            <w:r/>
+            <w:r>
+              <w:rPr>
+                <w:sz w:val="16"/>
+              </w:rPr>
+              <w:t>107x</w:t>
+            </w:r>
+          </w:p>
+        </w:tc>
+        <w:tc>
+          <w:tcPr>
+            <w:tcW w:type="dxa" w:w="794"/>
+          </w:tcPr>
+          <w:p>
+            <w:pPr>
+              <w:jc w:val="right"/>
+            </w:pPr>
+            <w:r/>
+            <w:r>
+              <w:rPr>
+                <w:sz w:val="16"/>
+              </w:rPr>
+              <w:t>79x</w:t>
+            </w:r>
+          </w:p>
+        </w:tc>
+        <w:tc>
+          <w:tcPr>
+            <w:tcW w:type="dxa" w:w="2948"/>
+          </w:tcPr>
+          <w:p>
+            <w:pPr>
+              <w:jc w:val="right"/>
+            </w:pPr>
+            <w:r/>
+            <w:r>
+              <w:rPr>
+                <w:sz w:val="16"/>
+              </w:rPr>
+              <w:t>revenue RMB5.77bn +12%, net profit RMB245m</w:t>
+            </w:r>
+          </w:p>
+        </w:tc>
+      </w:tr>
+      <w:tr>
+        <w:tc>
+          <w:tcPr>
+            <w:tcW w:type="dxa" w:w="1928"/>
+            <w:shd w:val="clear" w:color="auto" w:fill="F2F5F9"/>
+          </w:tcPr>
+          <w:p>
+            <w:r/>
+            <w:r>
+              <w:rPr>
+                <w:b/>
+                <w:sz w:val="16"/>
+              </w:rPr>
+              <w:t>981 SMIC</w:t>
+            </w:r>
+          </w:p>
+        </w:tc>
+        <w:tc>
+          <w:tcPr>
+            <w:tcW w:type="dxa" w:w="1020"/>
+            <w:shd w:val="clear" w:color="auto" w:fill="F2F5F9"/>
+          </w:tcPr>
+          <w:p>
+            <w:pPr>
+              <w:jc w:val="right"/>
+            </w:pPr>
+            <w:r/>
+            <w:r>
+              <w:rPr>
+                <w:sz w:val="16"/>
+              </w:rPr>
+              <w:t>585</w:t>
+            </w:r>
+          </w:p>
+        </w:tc>
+        <w:tc>
+          <w:tcPr>
+            <w:tcW w:type="dxa" w:w="1247"/>
+            <w:shd w:val="clear" w:color="auto" w:fill="F2F5F9"/>
+          </w:tcPr>
+          <w:p>
+            <w:pPr>
+              <w:jc w:val="right"/>
+            </w:pPr>
+            <w:r/>
+            <w:r>
+              <w:rPr>
+                <w:sz w:val="16"/>
+              </w:rPr>
+              <w:t>USD 677m</w:t>
+            </w:r>
+          </w:p>
+        </w:tc>
+        <w:tc>
+          <w:tcPr>
+            <w:tcW w:type="dxa" w:w="737"/>
+            <w:shd w:val="clear" w:color="auto" w:fill="F2F5F9"/>
+          </w:tcPr>
+          <w:p>
+            <w:pPr>
+              <w:jc w:val="right"/>
+            </w:pPr>
+            <w:r/>
+            <w:r>
+              <w:rPr>
+                <w:sz w:val="16"/>
+              </w:rPr>
+              <w:t>+111%</w:t>
+            </w:r>
+          </w:p>
+        </w:tc>
+        <w:tc>
+          <w:tcPr>
+            <w:tcW w:type="dxa" w:w="1077"/>
+            <w:shd w:val="clear" w:color="auto" w:fill="F2F5F9"/>
+          </w:tcPr>
+          <w:p>
+            <w:pPr>
+              <w:jc w:val="right"/>
+            </w:pPr>
+            <w:r/>
+            <w:r>
+              <w:rPr>
+                <w:sz w:val="16"/>
+              </w:rPr>
+              <w:t>55x</w:t>
+            </w:r>
+          </w:p>
+        </w:tc>
+        <w:tc>
+          <w:tcPr>
+            <w:tcW w:type="dxa" w:w="794"/>
+            <w:shd w:val="clear" w:color="auto" w:fill="F2F5F9"/>
+          </w:tcPr>
+          <w:p>
+            <w:pPr>
+              <w:jc w:val="right"/>
+            </w:pPr>
+            <w:r/>
+            <w:r>
+              <w:rPr>
+                <w:sz w:val="16"/>
+              </w:rPr>
+              <w:t>110x</w:t>
+            </w:r>
+          </w:p>
+        </w:tc>
+        <w:tc>
+          <w:tcPr>
+            <w:tcW w:type="dxa" w:w="2948"/>
+            <w:shd w:val="clear" w:color="auto" w:fill="F2F5F9"/>
+          </w:tcPr>
+          <w:p>
+            <w:pPr>
+              <w:jc w:val="right"/>
+            </w:pPr>
+            <w:r/>
+            <w:r>
+              <w:rPr>
+                <w:sz w:val="16"/>
+              </w:rPr>
+              <w:t>net profit US$677m; 2Q rev &gt;US$3bn, +20% QoQ (TrendForce)</w:t>
+            </w:r>
+          </w:p>
+        </w:tc>
+      </w:tr>
+      <w:tr>
+        <w:tc>
+          <w:tcPr>
+            <w:tcW w:type="dxa" w:w="1928"/>
+          </w:tcPr>
+          <w:p>
+            <w:r/>
+            <w:r>
+              <w:rPr>
+                <w:b/>
+                <w:sz w:val="16"/>
+              </w:rPr>
+              <w:t>1347 Hua Hong</w:t>
+            </w:r>
+          </w:p>
+        </w:tc>
+        <w:tc>
+          <w:tcPr>
+            <w:tcW w:type="dxa" w:w="1020"/>
+          </w:tcPr>
+          <w:p>
+            <w:pPr>
+              <w:jc w:val="right"/>
+            </w:pPr>
+            <w:r/>
+            <w:r>
+              <w:rPr>
+                <w:sz w:val="16"/>
+              </w:rPr>
+              <w:t>200</w:t>
+            </w:r>
+          </w:p>
+        </w:tc>
+        <w:tc>
+          <w:tcPr>
+            <w:tcW w:type="dxa" w:w="1247"/>
+          </w:tcPr>
+          <w:p>
+            <w:pPr>
+              <w:jc w:val="right"/>
+            </w:pPr>
+            <w:r/>
+            <w:r>
+              <w:rPr>
+                <w:sz w:val="16"/>
+              </w:rPr>
+              <w:t>USD 60m</w:t>
+            </w:r>
+          </w:p>
+        </w:tc>
+        <w:tc>
+          <w:tcPr>
+            <w:tcW w:type="dxa" w:w="737"/>
+          </w:tcPr>
+          <w:p>
+            <w:pPr>
+              <w:jc w:val="right"/>
+            </w:pPr>
+            <w:r/>
+            <w:r>
+              <w:rPr>
+                <w:sz w:val="16"/>
+              </w:rPr>
+              <w:t>+409%</w:t>
+            </w:r>
+          </w:p>
+        </w:tc>
+        <w:tc>
+          <w:tcPr>
+            <w:tcW w:type="dxa" w:w="1077"/>
+          </w:tcPr>
+          <w:p>
+            <w:pPr>
+              <w:jc w:val="right"/>
+            </w:pPr>
+            <w:r/>
+            <w:r>
+              <w:rPr>
+                <w:sz w:val="16"/>
+              </w:rPr>
+              <w:t>215x</w:t>
+            </w:r>
+          </w:p>
+        </w:tc>
+        <w:tc>
+          <w:tcPr>
+            <w:tcW w:type="dxa" w:w="794"/>
+          </w:tcPr>
+          <w:p>
+            <w:pPr>
+              <w:jc w:val="right"/>
+            </w:pPr>
+            <w:r/>
+            <w:r>
+              <w:rPr>
+                <w:sz w:val="16"/>
+              </w:rPr>
+              <w:t>468x</w:t>
+            </w:r>
+          </w:p>
+        </w:tc>
+        <w:tc>
+          <w:tcPr>
+            <w:tcW w:type="dxa" w:w="2948"/>
+          </w:tcPr>
+          <w:p>
+            <w:pPr>
+              <w:jc w:val="right"/>
+            </w:pPr>
+            <w:r/>
+            <w:r>
+              <w:rPr>
+                <w:sz w:val="16"/>
+              </w:rPr>
+              <w:t>net profit US$59.6m on record revenue; 2Q beat, positive 3Q guide (Citi)</w:t>
+            </w:r>
+          </w:p>
+        </w:tc>
+      </w:tr>
+      <w:tr>
+        <w:tc>
+          <w:tcPr>
+            <w:tcW w:type="dxa" w:w="1928"/>
+            <w:shd w:val="clear" w:color="auto" w:fill="F2F5F9"/>
+          </w:tcPr>
+          <w:p>
+            <w:r/>
+            <w:r>
+              <w:rPr>
+                <w:b/>
+                <w:sz w:val="16"/>
+              </w:rPr>
+              <w:t>9903 Iluvatar 天数</w:t>
+            </w:r>
+          </w:p>
+        </w:tc>
+        <w:tc>
+          <w:tcPr>
+            <w:tcW w:type="dxa" w:w="1020"/>
+            <w:shd w:val="clear" w:color="auto" w:fill="F2F5F9"/>
+          </w:tcPr>
+          <w:p>
+            <w:pPr>
+              <w:jc w:val="right"/>
+            </w:pPr>
+            <w:r/>
+            <w:r>
+              <w:rPr>
+                <w:sz w:val="16"/>
+              </w:rPr>
+              <w:t>91</w:t>
+            </w:r>
+          </w:p>
+        </w:tc>
+        <w:tc>
+          <w:tcPr>
+            <w:tcW w:type="dxa" w:w="1247"/>
+            <w:shd w:val="clear" w:color="auto" w:fill="F2F5F9"/>
+          </w:tcPr>
+          <w:p>
+            <w:pPr>
+              <w:jc w:val="right"/>
+            </w:pPr>
+            <w:r/>
+            <w:r>
+              <w:rPr>
+                <w:sz w:val="16"/>
+              </w:rPr>
+              <w:t>RMB 106m</w:t>
+            </w:r>
+          </w:p>
+        </w:tc>
+        <w:tc>
+          <w:tcPr>
+            <w:tcW w:type="dxa" w:w="737"/>
+            <w:shd w:val="clear" w:color="auto" w:fill="F2F5F9"/>
+          </w:tcPr>
+          <w:p>
+            <w:pPr>
+              <w:jc w:val="right"/>
+            </w:pPr>
+            <w:r/>
+            <w:r>
+              <w:rPr>
+                <w:sz w:val="16"/>
+              </w:rPr>
+              <w:t>to profit</w:t>
+            </w:r>
+          </w:p>
+        </w:tc>
+        <w:tc>
+          <w:tcPr>
+            <w:tcW w:type="dxa" w:w="1077"/>
+            <w:shd w:val="clear" w:color="auto" w:fill="F2F5F9"/>
+          </w:tcPr>
+          <w:p>
+            <w:pPr>
+              <w:jc w:val="right"/>
+            </w:pPr>
+            <w:r/>
+            <w:r>
+              <w:rPr>
+                <w:sz w:val="16"/>
+              </w:rPr>
+              <w:t>370x</w:t>
+            </w:r>
+          </w:p>
+        </w:tc>
+        <w:tc>
+          <w:tcPr>
+            <w:tcW w:type="dxa" w:w="794"/>
+            <w:shd w:val="clear" w:color="auto" w:fill="F2F5F9"/>
+          </w:tcPr>
+          <w:p>
+            <w:pPr>
+              <w:jc w:val="right"/>
+            </w:pPr>
+            <w:r/>
+            <w:r>
+              <w:rPr>
+                <w:sz w:val="16"/>
+              </w:rPr>
+              <w:t>loss</w:t>
+            </w:r>
+          </w:p>
+        </w:tc>
+        <w:tc>
+          <w:tcPr>
+            <w:tcW w:type="dxa" w:w="2948"/>
+            <w:shd w:val="clear" w:color="auto" w:fill="F2F5F9"/>
+          </w:tcPr>
+          <w:p>
+            <w:pPr>
+              <w:jc w:val="right"/>
+            </w:pPr>
+            <w:r/>
+            <w:r>
+              <w:rPr>
+                <w:sz w:val="16"/>
+              </w:rPr>
+              <w:t>revenue RMB946m +192%; GM 50.1% → 17.2%</w:t>
+            </w:r>
+          </w:p>
+        </w:tc>
+      </w:tr>
+    </w:tbl>
+    <w:p>
+      <w:pPr>
+        <w:spacing w:after="40"/>
+      </w:pPr>
+    </w:p>
+    <w:p>
+      <w:pPr>
+        <w:spacing w:after="80"/>
+      </w:pPr>
+      <w:r>
+        <w:rPr>
+          <w:i/>
+          <w:color w:val="595959"/>
+          <w:sz w:val="17"/>
+        </w:rPr>
+        <w:t>Annualising a first half is crude, and for GigaDevice it annualises a cycle peak — that is exactly the debate. But the feed’s 190x for GigaDevice vs 138x for Montage inverts the real relationship (22x vs 73x), and anyone trading the pair off screen multiples has it backwards.</w:t>
+      </w:r>
+    </w:p>
+    <w:p>
+      <w:pPr>
+        <w:pStyle w:val="Heading2"/>
+      </w:pPr>
+      <w:r>
+        <w:t>Plumbing — verified against the exchange lists</w:t>
       </w:r>
     </w:p>
     <w:p>
@@ -4703,7 +5635,7 @@
           <w:i w:val="0"/>
           <w:sz w:val="20"/>
         </w:rPr>
-        <w:t>HKEX only allows covered shorts in “designated securities”. Regular criteria: market cap ≥ HK$3bn and 12-month turnover velocity ≥ 60%, reviewed quarterly; a fast-track exists for new listings with public float ≥ HK$20bn over 20 sessions and ≥ HK$500m turnover. Applying the rules to the float/turnover numbers above (this is the rule-based read — confirm on the HKEX list the morning you trade):</w:t>
+        <w:t>HKEX only allows covered shorts in “designated securities” (market cap ≥ HK$3bn and 12-month turnover velocity ≥ 60%, reviewed quarterly, plus a fast-track for large new listings). The list effective 11 Sep 2026 carries the latest quarterly changes (39 in, 40 out — Epiworld and Viewtrix added, Axera removed on the velocity test). Southbound eligibility is from the SZSE 港股通标的 list dated 9 Sep 2026.</w:t>
       </w:r>
     </w:p>
     <w:tbl>
@@ -4740,7 +5672,7 @@
         </w:tc>
         <w:tc>
           <w:tcPr>
-            <w:tcW w:type="dxa" w:w="1361"/>
+            <w:tcW w:type="dxa" w:w="1701"/>
             <w:shd w:val="clear" w:color="auto" w:fill="1F3A5F"/>
           </w:tcPr>
           <w:p>
@@ -4751,13 +5683,13 @@
                 <w:color w:val="FFFFFF"/>
                 <w:sz w:val="16"/>
               </w:rPr>
-              <w:t>Shortable now?</w:t>
-            </w:r>
-          </w:p>
-        </w:tc>
-        <w:tc>
-          <w:tcPr>
-            <w:tcW w:type="dxa" w:w="3402"/>
+              <w:t>Shortable (HKEX list 11 Sep)</w:t>
+            </w:r>
+          </w:p>
+        </w:tc>
+        <w:tc>
+          <w:tcPr>
+            <w:tcW w:type="dxa" w:w="1474"/>
             <w:shd w:val="clear" w:color="auto" w:fill="1F3A5F"/>
           </w:tcPr>
           <w:p>
@@ -4768,13 +5700,13 @@
                 <w:color w:val="FFFFFF"/>
                 <w:sz w:val="16"/>
               </w:rPr>
-              <w:t>Why</w:t>
-            </w:r>
-          </w:p>
-        </w:tc>
-        <w:tc>
-          <w:tcPr>
-            <w:tcW w:type="dxa" w:w="1474"/>
+              <w:t>Southbound (SZSE 9 Sep)</w:t>
+            </w:r>
+          </w:p>
+        </w:tc>
+        <w:tc>
+          <w:tcPr>
+            <w:tcW w:type="dxa" w:w="1587"/>
             <w:shd w:val="clear" w:color="auto" w:fill="1F3A5F"/>
           </w:tcPr>
           <w:p>
@@ -4785,13 +5717,13 @@
                 <w:color w:val="FFFFFF"/>
                 <w:sz w:val="16"/>
               </w:rPr>
-              <w:t>Southbound</w:t>
-            </w:r>
-          </w:p>
-        </w:tc>
-        <w:tc>
-          <w:tcPr>
-            <w:tcW w:type="dxa" w:w="1474"/>
+              <w:t>Lock-up (cornerstone, 6m)</w:t>
+            </w:r>
+          </w:p>
+        </w:tc>
+        <w:tc>
+          <w:tcPr>
+            <w:tcW w:type="dxa" w:w="2948"/>
             <w:shd w:val="clear" w:color="auto" w:fill="1F3A5F"/>
           </w:tcPr>
           <w:p>
@@ -4802,7 +5734,7 @@
                 <w:color w:val="FFFFFF"/>
                 <w:sz w:val="16"/>
               </w:rPr>
-              <w:t>Lock-up (cornerstone, 6m)</w:t>
+              <w:t>Trading note</w:t>
             </w:r>
           </w:p>
         </w:tc>
@@ -4825,29 +5757,15 @@
         </w:tc>
         <w:tc>
           <w:tcPr>
-            <w:tcW w:type="dxa" w:w="1361"/>
-          </w:tcPr>
-          <w:p>
-            <w:r/>
-            <w:r>
-              <w:rPr>
-                <w:sz w:val="16"/>
-              </w:rPr>
-              <w:t>Yes</w:t>
-            </w:r>
-          </w:p>
-        </w:tc>
-        <w:tc>
-          <w:tcPr>
-            <w:tcW w:type="dxa" w:w="3402"/>
-          </w:tcPr>
-          <w:p>
-            <w:r/>
-            <w:r>
-              <w:rPr>
-                <w:sz w:val="16"/>
-              </w:rPr>
-              <w:t>index heavyweights, GC borrow</w:t>
+            <w:tcW w:type="dxa" w:w="1701"/>
+          </w:tcPr>
+          <w:p>
+            <w:r/>
+            <w:r>
+              <w:rPr>
+                <w:sz w:val="16"/>
+              </w:rPr>
+              <w:t>Yes / Yes</w:t>
             </w:r>
           </w:p>
         </w:tc>
@@ -4861,13 +5779,13 @@
               <w:rPr>
                 <w:sz w:val="16"/>
               </w:rPr>
-              <w:t>Yes</w:t>
-            </w:r>
-          </w:p>
-        </w:tc>
-        <w:tc>
-          <w:tcPr>
-            <w:tcW w:type="dxa" w:w="1474"/>
+              <w:t>Yes / Yes</w:t>
+            </w:r>
+          </w:p>
+        </w:tc>
+        <w:tc>
+          <w:tcPr>
+            <w:tcW w:type="dxa" w:w="1587"/>
           </w:tcPr>
           <w:p>
             <w:r/>
@@ -4876,6 +5794,20 @@
                 <w:sz w:val="16"/>
               </w:rPr>
               <w:t>—</w:t>
+            </w:r>
+          </w:p>
+        </w:tc>
+        <w:tc>
+          <w:tcPr>
+            <w:tcW w:type="dxa" w:w="2948"/>
+          </w:tcPr>
+          <w:p>
+            <w:r/>
+            <w:r>
+              <w:rPr>
+                <w:sz w:val="16"/>
+              </w:rPr>
+              <w:t>HK$4–5bn a day, GC borrow</w:t>
             </w:r>
           </w:p>
         </w:tc>
@@ -4899,7 +5831,7 @@
         </w:tc>
         <w:tc>
           <w:tcPr>
-            <w:tcW w:type="dxa" w:w="1361"/>
+            <w:tcW w:type="dxa" w:w="1701"/>
             <w:shd w:val="clear" w:color="auto" w:fill="F2F5F9"/>
           </w:tcPr>
           <w:p>
@@ -4908,22 +5840,7 @@
               <w:rPr>
                 <w:sz w:val="16"/>
               </w:rPr>
-              <w:t>Yes (expected)</w:t>
-            </w:r>
-          </w:p>
-        </w:tc>
-        <w:tc>
-          <w:tcPr>
-            <w:tcW w:type="dxa" w:w="3402"/>
-            <w:shd w:val="clear" w:color="auto" w:fill="F2F5F9"/>
-          </w:tcPr>
-          <w:p>
-            <w:r/>
-            <w:r>
-              <w:rPr>
-                <w:sz w:val="16"/>
-              </w:rPr>
-              <w:t>fast-track: float HK$16bn at IPO, ran &gt;HK$20bn by Feb; ADV HK$1.5bn</w:t>
+              <w:t>Yes</w:t>
             </w:r>
           </w:p>
         </w:tc>
@@ -4938,7 +5855,143 @@
               <w:rPr>
                 <w:sz w:val="16"/>
               </w:rPr>
-              <w:t>Yes (2026)</w:t>
+              <w:t>Yes</w:t>
+            </w:r>
+          </w:p>
+        </w:tc>
+        <w:tc>
+          <w:tcPr>
+            <w:tcW w:type="dxa" w:w="1587"/>
+            <w:shd w:val="clear" w:color="auto" w:fill="F2F5F9"/>
+          </w:tcPr>
+          <w:p>
+            <w:r/>
+            <w:r>
+              <w:rPr>
+                <w:sz w:val="16"/>
+              </w:rPr>
+              <w:t>expired 13 Jul 2026</w:t>
+            </w:r>
+          </w:p>
+        </w:tc>
+        <w:tc>
+          <w:tcPr>
+            <w:tcW w:type="dxa" w:w="2948"/>
+            <w:shd w:val="clear" w:color="auto" w:fill="F2F5F9"/>
+          </w:tcPr>
+          <w:p>
+            <w:r/>
+            <w:r>
+              <w:rPr>
+                <w:sz w:val="16"/>
+              </w:rPr>
+              <w:t>ADV HK$1.5bn; lendable pool &lt; H float (Southbound-held stock does not lend)</w:t>
+            </w:r>
+          </w:p>
+        </w:tc>
+      </w:tr>
+      <w:tr>
+        <w:tc>
+          <w:tcPr>
+            <w:tcW w:type="dxa" w:w="2041"/>
+          </w:tcPr>
+          <w:p>
+            <w:r/>
+            <w:r>
+              <w:rPr>
+                <w:b/>
+                <w:sz w:val="16"/>
+              </w:rPr>
+              <w:t>Montage 6809</w:t>
+            </w:r>
+          </w:p>
+        </w:tc>
+        <w:tc>
+          <w:tcPr>
+            <w:tcW w:type="dxa" w:w="1701"/>
+          </w:tcPr>
+          <w:p>
+            <w:r/>
+            <w:r>
+              <w:rPr>
+                <w:sz w:val="16"/>
+              </w:rPr>
+              <w:t>Yes</w:t>
+            </w:r>
+          </w:p>
+        </w:tc>
+        <w:tc>
+          <w:tcPr>
+            <w:tcW w:type="dxa" w:w="1474"/>
+          </w:tcPr>
+          <w:p>
+            <w:r/>
+            <w:r>
+              <w:rPr>
+                <w:sz w:val="16"/>
+              </w:rPr>
+              <w:t>Yes</w:t>
+            </w:r>
+          </w:p>
+        </w:tc>
+        <w:tc>
+          <w:tcPr>
+            <w:tcW w:type="dxa" w:w="1587"/>
+          </w:tcPr>
+          <w:p>
+            <w:r/>
+            <w:r>
+              <w:rPr>
+                <w:sz w:val="16"/>
+              </w:rPr>
+              <w:t>expired 9 Aug 2026</w:t>
+            </w:r>
+          </w:p>
+        </w:tc>
+        <w:tc>
+          <w:tcPr>
+            <w:tcW w:type="dxa" w:w="2948"/>
+          </w:tcPr>
+          <w:p>
+            <w:r/>
+            <w:r>
+              <w:rPr>
+                <w:sz w:val="16"/>
+              </w:rPr>
+              <w:t>ADV HK$1.0bn</w:t>
+            </w:r>
+          </w:p>
+        </w:tc>
+      </w:tr>
+      <w:tr>
+        <w:tc>
+          <w:tcPr>
+            <w:tcW w:type="dxa" w:w="2041"/>
+            <w:shd w:val="clear" w:color="auto" w:fill="F2F5F9"/>
+          </w:tcPr>
+          <w:p>
+            <w:r/>
+            <w:r>
+              <w:rPr>
+                <w:b/>
+                <w:sz w:val="16"/>
+              </w:rPr>
+              <w:t>Nexchip 2249</w:t>
+            </w:r>
+          </w:p>
+        </w:tc>
+        <w:tc>
+          <w:tcPr>
+            <w:tcW w:type="dxa" w:w="1701"/>
+            <w:shd w:val="clear" w:color="auto" w:fill="F2F5F9"/>
+          </w:tcPr>
+          <w:p>
+            <w:r/>
+            <w:r>
+              <w:rPr>
+                <w:sz w:val="16"/>
+              </w:rPr>
+              <w:t>NO</w:t>
             </w:r>
           </w:p>
         </w:tc>
@@ -4953,7 +6006,37 @@
               <w:rPr>
                 <w:sz w:val="16"/>
               </w:rPr>
-              <w:t>expired 13 Jul 2026</w:t>
+              <w:t>Yes</w:t>
+            </w:r>
+          </w:p>
+        </w:tc>
+        <w:tc>
+          <w:tcPr>
+            <w:tcW w:type="dxa" w:w="1587"/>
+            <w:shd w:val="clear" w:color="auto" w:fill="F2F5F9"/>
+          </w:tcPr>
+          <w:p>
+            <w:r/>
+            <w:r>
+              <w:rPr>
+                <w:sz w:val="16"/>
+              </w:rPr>
+              <w:t>10 Jan 2027</w:t>
+            </w:r>
+          </w:p>
+        </w:tc>
+        <w:tc>
+          <w:tcPr>
+            <w:tcW w:type="dxa" w:w="2948"/>
+            <w:shd w:val="clear" w:color="auto" w:fill="F2F5F9"/>
+          </w:tcPr>
+          <w:p>
+            <w:r/>
+            <w:r>
+              <w:rPr>
+                <w:sz w:val="16"/>
+              </w:rPr>
+              <w:t>H float HK$6.2bn, ADV HK$54m; earliest designation = December review</w:t>
             </w:r>
           </w:p>
         </w:tc>
@@ -4970,35 +6053,21 @@
                 <w:b/>
                 <w:sz w:val="16"/>
               </w:rPr>
-              <w:t>Montage 6809</w:t>
-            </w:r>
-          </w:p>
-        </w:tc>
-        <w:tc>
-          <w:tcPr>
-            <w:tcW w:type="dxa" w:w="1361"/>
-          </w:tcPr>
-          <w:p>
-            <w:r/>
-            <w:r>
-              <w:rPr>
-                <w:sz w:val="16"/>
-              </w:rPr>
-              <w:t>Yes (expected)</w:t>
-            </w:r>
-          </w:p>
-        </w:tc>
-        <w:tc>
-          <w:tcPr>
-            <w:tcW w:type="dxa" w:w="3402"/>
-          </w:tcPr>
-          <w:p>
-            <w:r/>
-            <w:r>
-              <w:rPr>
-                <w:sz w:val="16"/>
-              </w:rPr>
-              <w:t>float HK$21bn, ADV HK$1.0bn</w:t>
+              <w:t>Ingenic 3223 / Innolight 3308</w:t>
+            </w:r>
+          </w:p>
+        </w:tc>
+        <w:tc>
+          <w:tcPr>
+            <w:tcW w:type="dxa" w:w="1701"/>
+          </w:tcPr>
+          <w:p>
+            <w:r/>
+            <w:r>
+              <w:rPr>
+                <w:sz w:val="16"/>
+              </w:rPr>
+              <w:t>No / Yes</w:t>
             </w:r>
           </w:p>
         </w:tc>
@@ -5012,21 +6081,35 @@
               <w:rPr>
                 <w:sz w:val="16"/>
               </w:rPr>
-              <w:t>Yes (2026)</w:t>
-            </w:r>
-          </w:p>
-        </w:tc>
-        <w:tc>
-          <w:tcPr>
-            <w:tcW w:type="dxa" w:w="1474"/>
-          </w:tcPr>
-          <w:p>
-            <w:r/>
-            <w:r>
-              <w:rPr>
-                <w:sz w:val="16"/>
-              </w:rPr>
-              <w:t>expired 9 Aug 2026</w:t>
+              <w:t>No / Yes</w:t>
+            </w:r>
+          </w:p>
+        </w:tc>
+        <w:tc>
+          <w:tcPr>
+            <w:tcW w:type="dxa" w:w="1587"/>
+          </w:tcPr>
+          <w:p>
+            <w:r/>
+            <w:r>
+              <w:rPr>
+                <w:sz w:val="16"/>
+              </w:rPr>
+              <w:t>25 Feb 2027 / 30 Jan 2027</w:t>
+            </w:r>
+          </w:p>
+        </w:tc>
+        <w:tc>
+          <w:tcPr>
+            <w:tcW w:type="dxa" w:w="2948"/>
+          </w:tcPr>
+          <w:p>
+            <w:r/>
+            <w:r>
+              <w:rPr>
+                <w:sz w:val="16"/>
+              </w:rPr>
+              <w:t>Innolight ADV HK$1.8bn</w:t>
             </w:r>
           </w:p>
         </w:tc>
@@ -5044,13 +6127,13 @@
                 <w:b/>
                 <w:sz w:val="16"/>
               </w:rPr>
-              <w:t>Nexchip 2249</w:t>
-            </w:r>
-          </w:p>
-        </w:tc>
-        <w:tc>
-          <w:tcPr>
-            <w:tcW w:type="dxa" w:w="1361"/>
+              <w:t>OmniVision 501</w:t>
+            </w:r>
+          </w:p>
+        </w:tc>
+        <w:tc>
+          <w:tcPr>
+            <w:tcW w:type="dxa" w:w="1701"/>
             <w:shd w:val="clear" w:color="auto" w:fill="F2F5F9"/>
           </w:tcPr>
           <w:p>
@@ -5059,22 +6142,7 @@
               <w:rPr>
                 <w:sz w:val="16"/>
               </w:rPr>
-              <w:t>NO</w:t>
-            </w:r>
-          </w:p>
-        </w:tc>
-        <w:tc>
-          <w:tcPr>
-            <w:tcW w:type="dxa" w:w="3402"/>
-            <w:shd w:val="clear" w:color="auto" w:fill="F2F5F9"/>
-          </w:tcPr>
-          <w:p>
-            <w:r/>
-            <w:r>
-              <w:rPr>
-                <w:sz w:val="16"/>
-              </w:rPr>
-              <w:t>float HK$6.2bn (&lt;HK$20bn fast-track); listed 10 Jul → earliest = Nov quarterly review</w:t>
+              <w:t>Yes</w:t>
             </w:r>
           </w:p>
         </w:tc>
@@ -5089,7 +6157,143 @@
               <w:rPr>
                 <w:sz w:val="16"/>
               </w:rPr>
-              <w:t>Not yet — Dec review (eff. ~7 Dec)</w:t>
+              <w:t>Yes</w:t>
+            </w:r>
+          </w:p>
+        </w:tc>
+        <w:tc>
+          <w:tcPr>
+            <w:tcW w:type="dxa" w:w="1587"/>
+            <w:shd w:val="clear" w:color="auto" w:fill="F2F5F9"/>
+          </w:tcPr>
+          <w:p>
+            <w:r/>
+            <w:r>
+              <w:rPr>
+                <w:sz w:val="16"/>
+              </w:rPr>
+              <w:t>expired 12 Jul 2026</w:t>
+            </w:r>
+          </w:p>
+        </w:tc>
+        <w:tc>
+          <w:tcPr>
+            <w:tcW w:type="dxa" w:w="2948"/>
+            <w:shd w:val="clear" w:color="auto" w:fill="F2F5F9"/>
+          </w:tcPr>
+          <w:p>
+            <w:r/>
+            <w:r>
+              <w:rPr>
+                <w:sz w:val="16"/>
+              </w:rPr>
+              <w:t>ADV only HK$30m on a HK$3.7bn H float</w:t>
+            </w:r>
+          </w:p>
+        </w:tc>
+      </w:tr>
+      <w:tr>
+        <w:tc>
+          <w:tcPr>
+            <w:tcW w:type="dxa" w:w="2041"/>
+          </w:tcPr>
+          <w:p>
+            <w:r/>
+            <w:r>
+              <w:rPr>
+                <w:b/>
+                <w:sz w:val="16"/>
+              </w:rPr>
+              <w:t>SICC 2631 / Innoscience 2577</w:t>
+            </w:r>
+          </w:p>
+        </w:tc>
+        <w:tc>
+          <w:tcPr>
+            <w:tcW w:type="dxa" w:w="1701"/>
+          </w:tcPr>
+          <w:p>
+            <w:r/>
+            <w:r>
+              <w:rPr>
+                <w:sz w:val="16"/>
+              </w:rPr>
+              <w:t>Yes / Yes</w:t>
+            </w:r>
+          </w:p>
+        </w:tc>
+        <w:tc>
+          <w:tcPr>
+            <w:tcW w:type="dxa" w:w="1474"/>
+          </w:tcPr>
+          <w:p>
+            <w:r/>
+            <w:r>
+              <w:rPr>
+                <w:sz w:val="16"/>
+              </w:rPr>
+              <w:t>Yes / Yes</w:t>
+            </w:r>
+          </w:p>
+        </w:tc>
+        <w:tc>
+          <w:tcPr>
+            <w:tcW w:type="dxa" w:w="1587"/>
+          </w:tcPr>
+          <w:p>
+            <w:r/>
+            <w:r>
+              <w:rPr>
+                <w:sz w:val="16"/>
+              </w:rPr>
+              <w:t>expired</w:t>
+            </w:r>
+          </w:p>
+        </w:tc>
+        <w:tc>
+          <w:tcPr>
+            <w:tcW w:type="dxa" w:w="2948"/>
+          </w:tcPr>
+          <w:p>
+            <w:r/>
+            <w:r>
+              <w:rPr>
+                <w:sz w:val="16"/>
+              </w:rPr>
+              <w:t>ADV HK$180m / 210m</w:t>
+            </w:r>
+          </w:p>
+        </w:tc>
+      </w:tr>
+      <w:tr>
+        <w:tc>
+          <w:tcPr>
+            <w:tcW w:type="dxa" w:w="2041"/>
+            <w:shd w:val="clear" w:color="auto" w:fill="F2F5F9"/>
+          </w:tcPr>
+          <w:p>
+            <w:r/>
+            <w:r>
+              <w:rPr>
+                <w:b/>
+                <w:sz w:val="16"/>
+              </w:rPr>
+              <w:t>Horizon 9660 / Black Sesame 2533</w:t>
+            </w:r>
+          </w:p>
+        </w:tc>
+        <w:tc>
+          <w:tcPr>
+            <w:tcW w:type="dxa" w:w="1701"/>
+            <w:shd w:val="clear" w:color="auto" w:fill="F2F5F9"/>
+          </w:tcPr>
+          <w:p>
+            <w:r/>
+            <w:r>
+              <w:rPr>
+                <w:sz w:val="16"/>
+              </w:rPr>
+              <w:t>Yes / Yes</w:t>
             </w:r>
           </w:p>
         </w:tc>
@@ -5104,7 +6308,37 @@
               <w:rPr>
                 <w:sz w:val="16"/>
               </w:rPr>
-              <w:t>10 Jan 2027</w:t>
+              <w:t>Yes / Yes</w:t>
+            </w:r>
+          </w:p>
+        </w:tc>
+        <w:tc>
+          <w:tcPr>
+            <w:tcW w:type="dxa" w:w="1587"/>
+            <w:shd w:val="clear" w:color="auto" w:fill="F2F5F9"/>
+          </w:tcPr>
+          <w:p>
+            <w:r/>
+            <w:r>
+              <w:rPr>
+                <w:sz w:val="16"/>
+              </w:rPr>
+              <w:t>expired</w:t>
+            </w:r>
+          </w:p>
+        </w:tc>
+        <w:tc>
+          <w:tcPr>
+            <w:tcW w:type="dxa" w:w="2948"/>
+            <w:shd w:val="clear" w:color="auto" w:fill="F2F5F9"/>
+          </w:tcPr>
+          <w:p>
+            <w:r/>
+            <w:r>
+              <w:rPr>
+                <w:sz w:val="16"/>
+              </w:rPr>
+              <w:t>Black Sesame ADV HK$54m — borrow small and special</w:t>
             </w:r>
           </w:p>
         </w:tc>
@@ -5121,35 +6355,21 @@
                 <w:b/>
                 <w:sz w:val="16"/>
               </w:rPr>
-              <w:t>Ingenic 3223 / Innolight 3308</w:t>
-            </w:r>
-          </w:p>
-        </w:tc>
-        <w:tc>
-          <w:tcPr>
-            <w:tcW w:type="dxa" w:w="1361"/>
-          </w:tcPr>
-          <w:p>
-            <w:r/>
-            <w:r>
-              <w:rPr>
-                <w:sz w:val="16"/>
-              </w:rPr>
-              <w:t>No / probably (fast-track)</w:t>
-            </w:r>
-          </w:p>
-        </w:tc>
-        <w:tc>
-          <w:tcPr>
-            <w:tcW w:type="dxa" w:w="3402"/>
-          </w:tcPr>
-          <w:p>
-            <w:r/>
-            <w:r>
-              <w:rPr>
-                <w:sz w:val="16"/>
-              </w:rPr>
-              <w:t>Ingenic float HK$3.2bn; Innolight float HK$75bn, ADV HK$1.8bn</w:t>
+              <w:t>Biren 6082 / Iluvatar 9903</w:t>
+            </w:r>
+          </w:p>
+        </w:tc>
+        <w:tc>
+          <w:tcPr>
+            <w:tcW w:type="dxa" w:w="1701"/>
+          </w:tcPr>
+          <w:p>
+            <w:r/>
+            <w:r>
+              <w:rPr>
+                <w:sz w:val="16"/>
+              </w:rPr>
+              <w:t>Yes / Yes</w:t>
             </w:r>
           </w:p>
         </w:tc>
@@ -5163,21 +6383,35 @@
               <w:rPr>
                 <w:sz w:val="16"/>
               </w:rPr>
-              <w:t>No / check fast-entry</w:t>
-            </w:r>
-          </w:p>
-        </w:tc>
-        <w:tc>
-          <w:tcPr>
-            <w:tcW w:type="dxa" w:w="1474"/>
-          </w:tcPr>
-          <w:p>
-            <w:r/>
-            <w:r>
-              <w:rPr>
-                <w:sz w:val="16"/>
-              </w:rPr>
-              <w:t>25 Feb 2027 / 30 Jan 2027</w:t>
+              <w:t>Yes / Yes</w:t>
+            </w:r>
+          </w:p>
+        </w:tc>
+        <w:tc>
+          <w:tcPr>
+            <w:tcW w:type="dxa" w:w="1587"/>
+          </w:tcPr>
+          <w:p>
+            <w:r/>
+            <w:r>
+              <w:rPr>
+                <w:sz w:val="16"/>
+              </w:rPr>
+              <w:t>expired 2 Jul / 8 Jul 2026</w:t>
+            </w:r>
+          </w:p>
+        </w:tc>
+        <w:tc>
+          <w:tcPr>
+            <w:tcW w:type="dxa" w:w="2948"/>
+          </w:tcPr>
+          <w:p>
+            <w:r/>
+            <w:r>
+              <w:rPr>
+                <w:sz w:val="16"/>
+              </w:rPr>
+              <w:t>ADV HK$0.5bn / 0.8bn</w:t>
             </w:r>
           </w:p>
         </w:tc>
@@ -5195,13 +6429,13 @@
                 <w:b/>
                 <w:sz w:val="16"/>
               </w:rPr>
-              <w:t>OmniVision 501</w:t>
-            </w:r>
-          </w:p>
-        </w:tc>
-        <w:tc>
-          <w:tcPr>
-            <w:tcW w:type="dxa" w:w="1361"/>
+              <w:t>Gpixel 3277</w:t>
+            </w:r>
+          </w:p>
+        </w:tc>
+        <w:tc>
+          <w:tcPr>
+            <w:tcW w:type="dxa" w:w="1701"/>
             <w:shd w:val="clear" w:color="auto" w:fill="F2F5F9"/>
           </w:tcPr>
           <w:p>
@@ -5210,22 +6444,7 @@
               <w:rPr>
                 <w:sz w:val="16"/>
               </w:rPr>
-              <w:t>Probably (May/Aug review)</w:t>
-            </w:r>
-          </w:p>
-        </w:tc>
-        <w:tc>
-          <w:tcPr>
-            <w:tcW w:type="dxa" w:w="3402"/>
-            <w:shd w:val="clear" w:color="auto" w:fill="F2F5F9"/>
-          </w:tcPr>
-          <w:p>
-            <w:r/>
-            <w:r>
-              <w:rPr>
-                <w:sz w:val="16"/>
-              </w:rPr>
-              <w:t>float HK$3.7bn, velocity ~200% — but ADV only HK$30m</w:t>
+              <w:t>NO</w:t>
             </w:r>
           </w:p>
         </w:tc>
@@ -5240,7 +6459,143 @@
               <w:rPr>
                 <w:sz w:val="16"/>
               </w:rPr>
-              <w:t>Yes (2026)</w:t>
+              <w:t>Yes</w:t>
+            </w:r>
+          </w:p>
+        </w:tc>
+        <w:tc>
+          <w:tcPr>
+            <w:tcW w:type="dxa" w:w="1587"/>
+            <w:shd w:val="clear" w:color="auto" w:fill="F2F5F9"/>
+          </w:tcPr>
+          <w:p>
+            <w:r/>
+            <w:r>
+              <w:rPr>
+                <w:sz w:val="16"/>
+              </w:rPr>
+              <w:t>expired</w:t>
+            </w:r>
+          </w:p>
+        </w:tc>
+        <w:tc>
+          <w:tcPr>
+            <w:tcW w:type="dxa" w:w="2948"/>
+            <w:shd w:val="clear" w:color="auto" w:fill="F2F5F9"/>
+          </w:tcPr>
+          <w:p>
+            <w:r/>
+            <w:r>
+              <w:rPr>
+                <w:sz w:val="16"/>
+              </w:rPr>
+              <w:t>cannot be the short leg of anything</w:t>
+            </w:r>
+          </w:p>
+        </w:tc>
+      </w:tr>
+      <w:tr>
+        <w:tc>
+          <w:tcPr>
+            <w:tcW w:type="dxa" w:w="2041"/>
+          </w:tcPr>
+          <w:p>
+            <w:r/>
+            <w:r>
+              <w:rPr>
+                <w:b/>
+                <w:sz w:val="16"/>
+              </w:rPr>
+              <w:t>SG Micro 3661 / Novosense 2676</w:t>
+            </w:r>
+          </w:p>
+        </w:tc>
+        <w:tc>
+          <w:tcPr>
+            <w:tcW w:type="dxa" w:w="1701"/>
+          </w:tcPr>
+          <w:p>
+            <w:r/>
+            <w:r>
+              <w:rPr>
+                <w:sz w:val="16"/>
+              </w:rPr>
+              <w:t>No / Yes</w:t>
+            </w:r>
+          </w:p>
+        </w:tc>
+        <w:tc>
+          <w:tcPr>
+            <w:tcW w:type="dxa" w:w="1474"/>
+          </w:tcPr>
+          <w:p>
+            <w:r/>
+            <w:r>
+              <w:rPr>
+                <w:sz w:val="16"/>
+              </w:rPr>
+              <w:t>Yes / Yes</w:t>
+            </w:r>
+          </w:p>
+        </w:tc>
+        <w:tc>
+          <w:tcPr>
+            <w:tcW w:type="dxa" w:w="1587"/>
+          </w:tcPr>
+          <w:p>
+            <w:r/>
+            <w:r>
+              <w:rPr>
+                <w:sz w:val="16"/>
+              </w:rPr>
+              <w:t>26 Dec 2026 / expired</w:t>
+            </w:r>
+          </w:p>
+        </w:tc>
+        <w:tc>
+          <w:tcPr>
+            <w:tcW w:type="dxa" w:w="2948"/>
+          </w:tcPr>
+          <w:p>
+            <w:r/>
+            <w:r>
+              <w:rPr>
+                <w:sz w:val="16"/>
+              </w:rPr>
+              <w:t>ADV HK$60m / 40m</w:t>
+            </w:r>
+          </w:p>
+        </w:tc>
+      </w:tr>
+      <w:tr>
+        <w:tc>
+          <w:tcPr>
+            <w:tcW w:type="dxa" w:w="2041"/>
+            <w:shd w:val="clear" w:color="auto" w:fill="F2F5F9"/>
+          </w:tcPr>
+          <w:p>
+            <w:r/>
+            <w:r>
+              <w:rPr>
+                <w:b/>
+                <w:sz w:val="16"/>
+              </w:rPr>
+              <w:t>Axera 600</w:t>
+            </w:r>
+          </w:p>
+        </w:tc>
+        <w:tc>
+          <w:tcPr>
+            <w:tcW w:type="dxa" w:w="1701"/>
+            <w:shd w:val="clear" w:color="auto" w:fill="F2F5F9"/>
+          </w:tcPr>
+          <w:p>
+            <w:r/>
+            <w:r>
+              <w:rPr>
+                <w:sz w:val="16"/>
+              </w:rPr>
+              <w:t>No (removed 11 Sep)</w:t>
             </w:r>
           </w:p>
         </w:tc>
@@ -5255,104 +6610,28 @@
               <w:rPr>
                 <w:sz w:val="16"/>
               </w:rPr>
-              <w:t>expired 12 Jul 2026</w:t>
-            </w:r>
-          </w:p>
-        </w:tc>
-      </w:tr>
-      <w:tr>
-        <w:tc>
-          <w:tcPr>
-            <w:tcW w:type="dxa" w:w="2041"/>
-          </w:tcPr>
-          <w:p>
-            <w:r/>
-            <w:r>
-              <w:rPr>
-                <w:b/>
-                <w:sz w:val="16"/>
-              </w:rPr>
-              <w:t>SICC 2631 / Innoscience 2577</w:t>
-            </w:r>
-          </w:p>
-        </w:tc>
-        <w:tc>
-          <w:tcPr>
-            <w:tcW w:type="dxa" w:w="1361"/>
-          </w:tcPr>
-          <w:p>
-            <w:r/>
-            <w:r>
-              <w:rPr>
-                <w:sz w:val="16"/>
-              </w:rPr>
               <w:t>Yes</w:t>
             </w:r>
           </w:p>
         </w:tc>
         <w:tc>
           <w:tcPr>
-            <w:tcW w:type="dxa" w:w="3402"/>
-          </w:tcPr>
-          <w:p>
-            <w:r/>
-            <w:r>
-              <w:rPr>
-                <w:sz w:val="16"/>
-              </w:rPr>
-              <w:t>listed Aug-25 / Dec-24; ADV HK$180m / 210m</w:t>
-            </w:r>
-          </w:p>
-        </w:tc>
-        <w:tc>
-          <w:tcPr>
-            <w:tcW w:type="dxa" w:w="1474"/>
-          </w:tcPr>
-          <w:p>
-            <w:r/>
-            <w:r>
-              <w:rPr>
-                <w:sz w:val="16"/>
-              </w:rPr>
-              <w:t>Yes / Yes</w:t>
-            </w:r>
-          </w:p>
-        </w:tc>
-        <w:tc>
-          <w:tcPr>
-            <w:tcW w:type="dxa" w:w="1474"/>
-          </w:tcPr>
-          <w:p>
-            <w:r/>
-            <w:r>
-              <w:rPr>
-                <w:sz w:val="16"/>
-              </w:rPr>
-              <w:t>expired</w:t>
-            </w:r>
-          </w:p>
-        </w:tc>
-      </w:tr>
-      <w:tr>
-        <w:tc>
-          <w:tcPr>
-            <w:tcW w:type="dxa" w:w="2041"/>
+            <w:tcW w:type="dxa" w:w="1587"/>
             <w:shd w:val="clear" w:color="auto" w:fill="F2F5F9"/>
           </w:tcPr>
           <w:p>
             <w:r/>
             <w:r>
               <w:rPr>
-                <w:b/>
-                <w:sz w:val="16"/>
-              </w:rPr>
-              <w:t>Horizon 9660 / Black Sesame 2533</w:t>
-            </w:r>
-          </w:p>
-        </w:tc>
-        <w:tc>
-          <w:tcPr>
-            <w:tcW w:type="dxa" w:w="1361"/>
+                <w:sz w:val="16"/>
+              </w:rPr>
+              <w:t>expired 10 Aug 2026</w:t>
+            </w:r>
+          </w:p>
+        </w:tc>
+        <w:tc>
+          <w:tcPr>
+            <w:tcW w:type="dxa" w:w="2948"/>
             <w:shd w:val="clear" w:color="auto" w:fill="F2F5F9"/>
           </w:tcPr>
           <w:p>
@@ -5361,276 +6640,7 @@
               <w:rPr>
                 <w:sz w:val="16"/>
               </w:rPr>
-              <w:t>Yes / Yes (thin)</w:t>
-            </w:r>
-          </w:p>
-        </w:tc>
-        <w:tc>
-          <w:tcPr>
-            <w:tcW w:type="dxa" w:w="3402"/>
-            <w:shd w:val="clear" w:color="auto" w:fill="F2F5F9"/>
-          </w:tcPr>
-          <w:p>
-            <w:r/>
-            <w:r>
-              <w:rPr>
-                <w:sz w:val="16"/>
-              </w:rPr>
-              <w:t>Black Sesame float HK$7.6bn, ADV HK$54m — borrow will be small and special</w:t>
-            </w:r>
-          </w:p>
-        </w:tc>
-        <w:tc>
-          <w:tcPr>
-            <w:tcW w:type="dxa" w:w="1474"/>
-            <w:shd w:val="clear" w:color="auto" w:fill="F2F5F9"/>
-          </w:tcPr>
-          <w:p>
-            <w:r/>
-            <w:r>
-              <w:rPr>
-                <w:sz w:val="16"/>
-              </w:rPr>
-              <w:t>Yes / Yes</w:t>
-            </w:r>
-          </w:p>
-        </w:tc>
-        <w:tc>
-          <w:tcPr>
-            <w:tcW w:type="dxa" w:w="1474"/>
-            <w:shd w:val="clear" w:color="auto" w:fill="F2F5F9"/>
-          </w:tcPr>
-          <w:p>
-            <w:r/>
-            <w:r>
-              <w:rPr>
-                <w:sz w:val="16"/>
-              </w:rPr>
-              <w:t>expired</w:t>
-            </w:r>
-          </w:p>
-        </w:tc>
-      </w:tr>
-      <w:tr>
-        <w:tc>
-          <w:tcPr>
-            <w:tcW w:type="dxa" w:w="2041"/>
-          </w:tcPr>
-          <w:p>
-            <w:r/>
-            <w:r>
-              <w:rPr>
-                <w:b/>
-                <w:sz w:val="16"/>
-              </w:rPr>
-              <w:t>Biren 6082 / Iluvatar 9903</w:t>
-            </w:r>
-          </w:p>
-        </w:tc>
-        <w:tc>
-          <w:tcPr>
-            <w:tcW w:type="dxa" w:w="1361"/>
-          </w:tcPr>
-          <w:p>
-            <w:r/>
-            <w:r>
-              <w:rPr>
-                <w:sz w:val="16"/>
-              </w:rPr>
-              <w:t>Yes (expected)</w:t>
-            </w:r>
-          </w:p>
-        </w:tc>
-        <w:tc>
-          <w:tcPr>
-            <w:tcW w:type="dxa" w:w="3402"/>
-          </w:tcPr>
-          <w:p>
-            <w:r/>
-            <w:r>
-              <w:rPr>
-                <w:sz w:val="16"/>
-              </w:rPr>
-              <w:t>float HK$56bn / 88bn, ADV HK$0.5bn / 0.8bn</w:t>
-            </w:r>
-          </w:p>
-        </w:tc>
-        <w:tc>
-          <w:tcPr>
-            <w:tcW w:type="dxa" w:w="1474"/>
-          </w:tcPr>
-          <w:p>
-            <w:r/>
-            <w:r>
-              <w:rPr>
-                <w:sz w:val="16"/>
-              </w:rPr>
-              <w:t>Yes (2026)</w:t>
-            </w:r>
-          </w:p>
-        </w:tc>
-        <w:tc>
-          <w:tcPr>
-            <w:tcW w:type="dxa" w:w="1474"/>
-          </w:tcPr>
-          <w:p>
-            <w:r/>
-            <w:r>
-              <w:rPr>
-                <w:sz w:val="16"/>
-              </w:rPr>
-              <w:t>expired 2 Jul / 8 Jul 2026</w:t>
-            </w:r>
-          </w:p>
-        </w:tc>
-      </w:tr>
-      <w:tr>
-        <w:tc>
-          <w:tcPr>
-            <w:tcW w:type="dxa" w:w="2041"/>
-            <w:shd w:val="clear" w:color="auto" w:fill="F2F5F9"/>
-          </w:tcPr>
-          <w:p>
-            <w:r/>
-            <w:r>
-              <w:rPr>
-                <w:b/>
-                <w:sz w:val="16"/>
-              </w:rPr>
-              <w:t>Gpixel 3277</w:t>
-            </w:r>
-          </w:p>
-        </w:tc>
-        <w:tc>
-          <w:tcPr>
-            <w:tcW w:type="dxa" w:w="1361"/>
-            <w:shd w:val="clear" w:color="auto" w:fill="F2F5F9"/>
-          </w:tcPr>
-          <w:p>
-            <w:r/>
-            <w:r>
-              <w:rPr>
-                <w:sz w:val="16"/>
-              </w:rPr>
-              <w:t>Probably (fast-track)</w:t>
-            </w:r>
-          </w:p>
-        </w:tc>
-        <w:tc>
-          <w:tcPr>
-            <w:tcW w:type="dxa" w:w="3402"/>
-            <w:shd w:val="clear" w:color="auto" w:fill="F2F5F9"/>
-          </w:tcPr>
-          <w:p>
-            <w:r/>
-            <w:r>
-              <w:rPr>
-                <w:sz w:val="16"/>
-              </w:rPr>
-              <w:t>float HK$25bn, ADV HK$61m</w:t>
-            </w:r>
-          </w:p>
-        </w:tc>
-        <w:tc>
-          <w:tcPr>
-            <w:tcW w:type="dxa" w:w="1474"/>
-            <w:shd w:val="clear" w:color="auto" w:fill="F2F5F9"/>
-          </w:tcPr>
-          <w:p>
-            <w:r/>
-            <w:r>
-              <w:rPr>
-                <w:sz w:val="16"/>
-              </w:rPr>
-              <w:t>check</w:t>
-            </w:r>
-          </w:p>
-        </w:tc>
-        <w:tc>
-          <w:tcPr>
-            <w:tcW w:type="dxa" w:w="1474"/>
-            <w:shd w:val="clear" w:color="auto" w:fill="F2F5F9"/>
-          </w:tcPr>
-          <w:p>
-            <w:r/>
-            <w:r>
-              <w:rPr>
-                <w:sz w:val="16"/>
-              </w:rPr>
-              <w:t>expired</w:t>
-            </w:r>
-          </w:p>
-        </w:tc>
-      </w:tr>
-      <w:tr>
-        <w:tc>
-          <w:tcPr>
-            <w:tcW w:type="dxa" w:w="2041"/>
-          </w:tcPr>
-          <w:p>
-            <w:r/>
-            <w:r>
-              <w:rPr>
-                <w:b/>
-                <w:sz w:val="16"/>
-              </w:rPr>
-              <w:t>SG Micro 3661 / Novosense 2676</w:t>
-            </w:r>
-          </w:p>
-        </w:tc>
-        <w:tc>
-          <w:tcPr>
-            <w:tcW w:type="dxa" w:w="1361"/>
-          </w:tcPr>
-          <w:p>
-            <w:r/>
-            <w:r>
-              <w:rPr>
-                <w:sz w:val="16"/>
-              </w:rPr>
-              <w:t>No (Nov review) / probably</w:t>
-            </w:r>
-          </w:p>
-        </w:tc>
-        <w:tc>
-          <w:tcPr>
-            <w:tcW w:type="dxa" w:w="3402"/>
-          </w:tcPr>
-          <w:p>
-            <w:r/>
-            <w:r>
-              <w:rPr>
-                <w:sz w:val="16"/>
-              </w:rPr>
-              <w:t>SG Micro float HK$5.5bn, listed 26 Jun; Novosense float HK$3.2bn</w:t>
-            </w:r>
-          </w:p>
-        </w:tc>
-        <w:tc>
-          <w:tcPr>
-            <w:tcW w:type="dxa" w:w="1474"/>
-          </w:tcPr>
-          <w:p>
-            <w:r/>
-            <w:r>
-              <w:rPr>
-                <w:sz w:val="16"/>
-              </w:rPr>
-              <w:t>check / Yes</w:t>
-            </w:r>
-          </w:p>
-        </w:tc>
-        <w:tc>
-          <w:tcPr>
-            <w:tcW w:type="dxa" w:w="1474"/>
-          </w:tcPr>
-          <w:p>
-            <w:r/>
-            <w:r>
-              <w:rPr>
-                <w:sz w:val="16"/>
-              </w:rPr>
-              <w:t>26 Dec 2026 / expired</w:t>
+              <w:t>velocity 41% &lt; 60% — the rule working</w:t>
             </w:r>
           </w:p>
         </w:tc>
@@ -5646,7 +6656,7 @@
         <w:pStyle w:val="Heading1"/>
       </w:pPr>
       <w:r>
-        <w:t>2. Pair 1 — Long Nexchip 2249 / Short GigaDevice 3986</w:t>
+        <w:t>2. Pair 1 — Nexchip 2249 vs GigaDevice 3986: right idea, one direction, not yet</w:t>
       </w:r>
     </w:p>
     <w:p>
@@ -5663,7 +6673,7 @@
         <w:rPr>
           <w:i w:val="0"/>
         </w:rPr>
-        <w:t>Ratio quoted as GigaDevice ÷ Nexchip (H prices): 17.9 now. You want it lower.</w:t>
+        <w:t>Long GigaDevice / short Nexchip when Nexchip is designated (December review at the earliest). Until then: long GigaDevice hedged with SMIC, and do not be long Nexchip.</w:t>
       </w:r>
     </w:p>
     <w:p>
@@ -5691,10 +6701,10 @@
         <w:rPr>
           <w:b/>
         </w:rPr>
-        <w:t xml:space="preserve">You cannot short Nexchip, so the question is only whether to be long it. </w:t>
+        <w:t xml:space="preserve">The prints settle the direction. </w:t>
       </w:r>
       <w:r>
-        <w:t>H float is HK$6.2bn (10% of the company), listed 10 Jul: no fast-track, and the regular designation needs the November review. Anyone who wants to be short the DDIC foundry story is stuck until then — the first two months of a new H-line with no shorts and no Southbound is exactly when the discount is widest.</w:t>
+        <w:t>GigaDevice 1H26 net profit RMB6.86bn, up 10.9x, on DDR4/LPDDR4 and NOR pricing — it is fabless and rents the price cycle, and this half it rented a very good one; BofA took the A-share target to RMB663 on the print. Nexchip 1H26: revenue RMB5.77bn +12%, net profit RMB245m −26% — volume up, margin down, which is what a DDIC-heavy 12-inch foundry with new depreciation looks like when display-driver pricing is soft. Annualised, that is 22x for GigaDevice and 107x for Nexchip.</w:t>
       </w:r>
     </w:p>
     <w:p>
@@ -5706,10 +6716,10 @@
         <w:rPr>
           <w:b/>
         </w:rPr>
-        <w:t xml:space="preserve">The discount is the trade. </w:t>
+        <w:t xml:space="preserve">The H discount is not the bargain it looks. </w:t>
       </w:r>
       <w:r>
-        <w:t>Nexchip H is 53% below its A (A HK$42.0 equivalent vs H HK$27.5). It was 96% on debut and 35% at the 14-Aug low, so it has already closed once on nothing but offshore buying; it re-widened as the H fell 25% from 17 Aug on sector supply while the A fell less. Southbound is the marginal buyer that closes these — Nexchip missed the September HSCI review (30-Jun cut-off) so the December review (announced ~20 Nov, effective ~7 Dec) is the date. Every 2026 A+H chip listing has seen its discount compress into and through inclusion; GigaDevice and Montage went all the way through zero.</w:t>
+        <w:t>Nexchip H is 53% below its A. It was 96% on debut and 35% at the 14-Aug low, so the gap closed once on nothing but offshore buying and re-opened as the H fell 25% from 17 Aug. The buyer that normally closes these — Southbound — already has access (it is on the SZSE list dated 9 Sep). If a 53% discount does not compress with Southbound open and the cornerstone book still locked, the H is telling you the A is wrong, not the other way round. Note also Huaqin, the ODM, has been adding to its A-share stake (10.8% by April) — a strategic holder supporting the A leg keeps the gap wide rather than closing it.</w:t>
       </w:r>
     </w:p>
     <w:p>
@@ -5721,10 +6731,10 @@
         <w:rPr>
           <w:b/>
         </w:rPr>
-        <w:t xml:space="preserve">GigaDevice is the expensive line of an expensive story. </w:t>
+        <w:t xml:space="preserve">You cannot short Nexchip today. </w:t>
       </w:r>
       <w:r>
-        <w:t>Its H trades 8.5% ABOVE the A on 190x trailing earnings (feed). That premium is Southbound and offshore money crowding an H float of HK$16bn — it is a positioning artefact, not a valuation, and it reverses when the memory tape turns. The 2026 re-rating is a DDR4/LPDDR4 and NOR price story (the majors walked away from legacy DRAM); GigaDevice is fabless and buys its DRAM wafers, so it rents the price cycle — margin goes up with contract prices and comes down with them, and Q4 contract pricing (TrendForce, end-Sep) is the first place the second derivative shows.</w:t>
+        <w:t>It is absent from the HKEX designated lists of 1, 10 and 11 Sep; the 11 Sep list carries the quarterly review changes, so the next chance is the December review. That lands about three weeks before the 10 Jan 2027 cornerstone unlock on a HK$6.2bn float that trades HK$54m a day — the cleanest set-up in the note, and the reason to diarise rather than force it.</w:t>
       </w:r>
     </w:p>
     <w:p>
@@ -5736,10 +6746,10 @@
         <w:rPr>
           <w:b/>
         </w:rPr>
-        <w:t xml:space="preserve">The A-share ratio says the same thing. </w:t>
+        <w:t xml:space="preserve">Why long GigaDevice now rather than wait. </w:t>
       </w:r>
       <w:r>
-        <w:t>GigaDevice_A ÷ Nexchip_A is 10.7 — the 95th percentile since January 2024 (mean 6.3; 250-day mean 8.5; peaked 13.8 on 29 Jun). The H ratio of 17.9 is that 10.7 times the two A/H distortions (1.53 ÷ 0.915). Both components — the A-ratio and the A/H gap — point the same way.</w:t>
+        <w:t>Memory equities top on the second derivative, and the −60% from 29 Jun already prices the deceleration TrendForce printed (+59.5% industry revenue in Q2, +13–18% contract prices in Q3). Supplier inventories are at historic lows, GigaDevice’s own view (Dec-25) was no relief through 2026 with 2H prices “moderately upward”, and the company has an RMB1–2bn A-share buyback. At 22x annualised the bet is that Q4 stays positive — the late-September TrendForce outlook is the gate. If you can buy the A, buy the A: the H’s 8.5% premium is the cost of the offshore ticket.</w:t>
       </w:r>
     </w:p>
     <w:p>
@@ -5751,10 +6761,10 @@
         <w:rPr>
           <w:b/>
         </w:rPr>
-        <w:t xml:space="preserve">What Nexchip actually is. </w:t>
+        <w:t xml:space="preserve">The hedge. </w:t>
       </w:r>
       <w:r>
-        <w:t>12-inch mature-node foundry: display drivers are over half of revenue, then CIS, PMIC, MCU; 28nm OLED DDIC ramping; heavy depreciation, low-20s gross margin, 79x trailing on the H (feed). Not a great business, and DDIC pricing into a flat panel market is the weak spot — but you are not paying for the business, you are paying 47% of the price the A-share market pays for the same claim, with a date on which that gap gets a buyer.</w:t>
+        <w:t>SMIC is the liquid sector beta: correlation with GigaDevice 0.69 over 40 days, 60% vol vs 100%, HK$5bn a day, GC borrow. It is a hedge, not alpha — SMIC’s own print (+111%) is strong. Vol-neutral is 0.6 of SMIC per 1.0 of GigaDevice.</w:t>
       </w:r>
     </w:p>
     <w:tbl>
@@ -6008,7 +7018,7 @@
                 <w:b/>
                 <w:sz w:val="16"/>
               </w:rPr>
-              <w:t>H since 10 Jul (41d)</w:t>
+              <w:t>GigaDevice/Nexchip H since 10 Jul</w:t>
             </w:r>
           </w:p>
         </w:tc>
@@ -6196,7 +7206,7 @@
                 <w:b/>
                 <w:sz w:val="16"/>
               </w:rPr>
-              <w:t>H last 40d</w:t>
+              <w:t>GigaDevice/Nexchip H 40d</w:t>
             </w:r>
           </w:p>
         </w:tc>
@@ -6393,7 +7403,7 @@
                 <w:b/>
                 <w:sz w:val="16"/>
               </w:rPr>
-              <w:t>A-shares since Jan-24</w:t>
+              <w:t>GigaDevice/Nexchip A since Jan-24</w:t>
             </w:r>
           </w:p>
         </w:tc>
@@ -6581,7 +7591,7 @@
                 <w:b/>
                 <w:sz w:val="16"/>
               </w:rPr>
-              <w:t>A-shares last 250d</w:t>
+              <w:t>GigaDevice/Nexchip A 250d</w:t>
             </w:r>
           </w:p>
         </w:tc>
@@ -6778,7 +7788,7 @@
                 <w:b/>
                 <w:sz w:val="16"/>
               </w:rPr>
-              <w:t>Alt short: SMIC/Nexchip (H)</w:t>
+              <w:t>GigaDevice/SMIC H since 13 Jan</w:t>
             </w:r>
           </w:p>
         </w:tc>
@@ -6795,7 +7805,7 @@
               <w:rPr>
                 <w:sz w:val="16"/>
               </w:rPr>
-              <w:t>2.484</w:t>
+              <w:t>7.20</w:t>
             </w:r>
           </w:p>
         </w:tc>
@@ -6812,7 +7822,7 @@
               <w:rPr>
                 <w:sz w:val="16"/>
               </w:rPr>
-              <w:t>2.262</w:t>
+              <w:t>7.02</w:t>
             </w:r>
           </w:p>
         </w:tc>
@@ -6829,7 +7839,7 @@
               <w:rPr>
                 <w:sz w:val="16"/>
               </w:rPr>
-              <w:t>1.987 – 2.654</w:t>
+              <w:t>2.96 – 14.63</w:t>
             </w:r>
           </w:p>
         </w:tc>
@@ -6846,7 +7856,7 @@
               <w:rPr>
                 <w:sz w:val="16"/>
               </w:rPr>
-              <w:t>90</w:t>
+              <w:t>52</w:t>
             </w:r>
           </w:p>
         </w:tc>
@@ -6863,7 +7873,7 @@
               <w:rPr>
                 <w:sz w:val="16"/>
               </w:rPr>
-              <w:t>+1.2</w:t>
+              <w:t>+0.1</w:t>
             </w:r>
           </w:p>
         </w:tc>
@@ -6880,7 +7890,7 @@
               <w:rPr>
                 <w:sz w:val="16"/>
               </w:rPr>
-              <w:t>0.65</w:t>
+              <w:t>0.57</w:t>
             </w:r>
           </w:p>
         </w:tc>
@@ -6897,7 +7907,7 @@
               <w:rPr>
                 <w:sz w:val="16"/>
               </w:rPr>
-              <w:t>0.51</w:t>
+              <w:t>1.11</w:t>
             </w:r>
           </w:p>
         </w:tc>
@@ -6914,7 +7924,7 @@
               <w:rPr>
                 <w:sz w:val="16"/>
               </w:rPr>
-              <w:t>59 / 74</w:t>
+              <w:t>119 / 61</w:t>
             </w:r>
           </w:p>
         </w:tc>
@@ -6931,7 +7941,7 @@
               <w:rPr>
                 <w:sz w:val="16"/>
               </w:rPr>
-              <w:t>58</w:t>
+              <w:t>98</w:t>
             </w:r>
           </w:p>
         </w:tc>
@@ -6948,7 +7958,205 @@
               <w:rPr>
                 <w:sz w:val="16"/>
               </w:rPr>
-              <w:t>41</w:t>
+              <w:t>159</w:t>
+            </w:r>
+          </w:p>
+        </w:tc>
+      </w:tr>
+      <w:tr>
+        <w:tc>
+          <w:tcPr>
+            <w:tcW w:type="dxa" w:w="1928"/>
+            <w:shd w:val="clear" w:color="auto" w:fill="F2F5F9"/>
+          </w:tcPr>
+          <w:p>
+            <w:r/>
+            <w:r>
+              <w:rPr>
+                <w:b/>
+                <w:sz w:val="16"/>
+              </w:rPr>
+              <w:t>GigaDevice/SMIC H 40d</w:t>
+            </w:r>
+          </w:p>
+        </w:tc>
+        <w:tc>
+          <w:tcPr>
+            <w:tcW w:type="dxa" w:w="850"/>
+            <w:shd w:val="clear" w:color="auto" w:fill="F2F5F9"/>
+          </w:tcPr>
+          <w:p>
+            <w:pPr>
+              <w:jc w:val="right"/>
+            </w:pPr>
+            <w:r/>
+            <w:r>
+              <w:rPr>
+                <w:sz w:val="16"/>
+              </w:rPr>
+              <w:t>7.20</w:t>
+            </w:r>
+          </w:p>
+        </w:tc>
+        <w:tc>
+          <w:tcPr>
+            <w:tcW w:type="dxa" w:w="794"/>
+            <w:shd w:val="clear" w:color="auto" w:fill="F2F5F9"/>
+          </w:tcPr>
+          <w:p>
+            <w:pPr>
+              <w:jc w:val="right"/>
+            </w:pPr>
+            <w:r/>
+            <w:r>
+              <w:rPr>
+                <w:sz w:val="16"/>
+              </w:rPr>
+              <w:t>7.32</w:t>
+            </w:r>
+          </w:p>
+        </w:tc>
+        <w:tc>
+          <w:tcPr>
+            <w:tcW w:type="dxa" w:w="1474"/>
+            <w:shd w:val="clear" w:color="auto" w:fill="F2F5F9"/>
+          </w:tcPr>
+          <w:p>
+            <w:pPr>
+              <w:jc w:val="right"/>
+            </w:pPr>
+            <w:r/>
+            <w:r>
+              <w:rPr>
+                <w:sz w:val="16"/>
+              </w:rPr>
+              <w:t>6.50 – 8.79</w:t>
+            </w:r>
+          </w:p>
+        </w:tc>
+        <w:tc>
+          <w:tcPr>
+            <w:tcW w:type="dxa" w:w="624"/>
+            <w:shd w:val="clear" w:color="auto" w:fill="F2F5F9"/>
+          </w:tcPr>
+          <w:p>
+            <w:pPr>
+              <w:jc w:val="right"/>
+            </w:pPr>
+            <w:r/>
+            <w:r>
+              <w:rPr>
+                <w:sz w:val="16"/>
+              </w:rPr>
+              <w:t>45</w:t>
+            </w:r>
+          </w:p>
+        </w:tc>
+        <w:tc>
+          <w:tcPr>
+            <w:tcW w:type="dxa" w:w="510"/>
+            <w:shd w:val="clear" w:color="auto" w:fill="F2F5F9"/>
+          </w:tcPr>
+          <w:p>
+            <w:pPr>
+              <w:jc w:val="right"/>
+            </w:pPr>
+            <w:r/>
+            <w:r>
+              <w:rPr>
+                <w:sz w:val="16"/>
+              </w:rPr>
+              <w:t>-0.2</w:t>
+            </w:r>
+          </w:p>
+        </w:tc>
+        <w:tc>
+          <w:tcPr>
+            <w:tcW w:type="dxa" w:w="567"/>
+            <w:shd w:val="clear" w:color="auto" w:fill="F2F5F9"/>
+          </w:tcPr>
+          <w:p>
+            <w:pPr>
+              <w:jc w:val="right"/>
+            </w:pPr>
+            <w:r/>
+            <w:r>
+              <w:rPr>
+                <w:sz w:val="16"/>
+              </w:rPr>
+              <w:t>0.71</w:t>
+            </w:r>
+          </w:p>
+        </w:tc>
+        <w:tc>
+          <w:tcPr>
+            <w:tcW w:type="dxa" w:w="964"/>
+            <w:shd w:val="clear" w:color="auto" w:fill="F2F5F9"/>
+          </w:tcPr>
+          <w:p>
+            <w:pPr>
+              <w:jc w:val="right"/>
+            </w:pPr>
+            <w:r/>
+            <w:r>
+              <w:rPr>
+                <w:sz w:val="16"/>
+              </w:rPr>
+              <w:t>1.18</w:t>
+            </w:r>
+          </w:p>
+        </w:tc>
+        <w:tc>
+          <w:tcPr>
+            <w:tcW w:type="dxa" w:w="1077"/>
+            <w:shd w:val="clear" w:color="auto" w:fill="F2F5F9"/>
+          </w:tcPr>
+          <w:p>
+            <w:pPr>
+              <w:jc w:val="right"/>
+            </w:pPr>
+            <w:r/>
+            <w:r>
+              <w:rPr>
+                <w:sz w:val="16"/>
+              </w:rPr>
+              <w:t>100 / 60</w:t>
+            </w:r>
+          </w:p>
+        </w:tc>
+        <w:tc>
+          <w:tcPr>
+            <w:tcW w:type="dxa" w:w="964"/>
+            <w:shd w:val="clear" w:color="auto" w:fill="F2F5F9"/>
+          </w:tcPr>
+          <w:p>
+            <w:pPr>
+              <w:jc w:val="right"/>
+            </w:pPr>
+            <w:r/>
+            <w:r>
+              <w:rPr>
+                <w:sz w:val="16"/>
+              </w:rPr>
+              <w:t>71</w:t>
+            </w:r>
+          </w:p>
+        </w:tc>
+        <w:tc>
+          <w:tcPr>
+            <w:tcW w:type="dxa" w:w="454"/>
+            <w:shd w:val="clear" w:color="auto" w:fill="F2F5F9"/>
+          </w:tcPr>
+          <w:p>
+            <w:pPr>
+              <w:jc w:val="right"/>
+            </w:pPr>
+            <w:r/>
+            <w:r>
+              <w:rPr>
+                <w:sz w:val="16"/>
+              </w:rPr>
+              <w:t>39</w:t>
             </w:r>
           </w:p>
         </w:tc>
@@ -6982,7 +8190,7 @@
                 <w:b/>
                 <w:sz w:val="19"/>
               </w:rPr>
-              <w:t>Legs</w:t>
+              <w:t>Now (interim)</w:t>
             </w:r>
           </w:p>
         </w:tc>
@@ -6996,7 +8204,7 @@
               <w:rPr>
                 <w:sz w:val="19"/>
               </w:rPr>
-              <w:t>Long Nexchip 2249 HK$5m / short GigaDevice 3986 HK$3.5m (vol-neutral 0.7:1; 1:1 dollar gives spread vol 78%, 0.7:1 gives ~58%). Beta-neutral would be 0.47:1 but leaves you net long sector.</w:t>
+              <w:t>Long GigaDevice 3986 HK$10m / short SMIC 981 HK$6m. Ratio GigaDevice/SMIC = 7.2. Target 9.0 (+25%, the mid-August level); stop 6.0 (−17%); exit regardless if the TrendForce Q4 conventional-DRAM outlook is ≤ +5%.</w:t>
             </w:r>
           </w:p>
         </w:tc>
@@ -7014,7 +8222,7 @@
                 <w:b/>
                 <w:sz w:val="19"/>
               </w:rPr>
-              <w:t>Size</w:t>
+              <w:t>December (the real pair)</w:t>
             </w:r>
           </w:p>
         </w:tc>
@@ -7028,7 +8236,7 @@
               <w:rPr>
                 <w:sz w:val="19"/>
               </w:rPr>
-              <w:t>Cap the long leg at ~10% of ADV per day: Nexchip trades HK$54m/day, so HK$5m is a two-session build. GigaDevice (HK$1.5bn/day) is a click.</w:t>
+              <w:t>Long GigaDevice / short Nexchip 1 : 0.7 (vol-neutral) once Nexchip is designated. Reference points on the ratio: 23.3 debut high, 14.6 low (14 Aug), 17.9 now, mean 16.7. Trade it into the 10 Jan unlock; the A-ratio (10.7, 95th percentile since 2024) is the argument against — it says GigaDevice has already re-rated a lot vs Nexchip on the mainland too.</w:t>
             </w:r>
           </w:p>
         </w:tc>
@@ -7046,7 +8254,7 @@
                 <w:b/>
                 <w:sz w:val="19"/>
               </w:rPr>
-              <w:t>Entry</w:t>
+              <w:t>Size</w:t>
             </w:r>
           </w:p>
         </w:tc>
@@ -7060,7 +8268,7 @@
               <w:rPr>
                 <w:sz w:val="19"/>
               </w:rPr>
-              <w:t>Ratio ≥ 17.5 (now 17.9). Do not chase below 16.5.</w:t>
+              <w:t>Half normal on the interim leg (it is a hedged single-name bet with ~80% spread vol, not a pair). Full size only for the December pair.</w:t>
             </w:r>
           </w:p>
         </w:tc>
@@ -7078,7 +8286,7 @@
                 <w:b/>
                 <w:sz w:val="19"/>
               </w:rPr>
-              <w:t>Target</w:t>
+              <w:t>Borrow</w:t>
             </w:r>
           </w:p>
         </w:tc>
@@ -7092,7 +8300,7 @@
               <w:rPr>
                 <w:sz w:val="19"/>
               </w:rPr>
-              <w:t>15.0 (−16%): the mid-August level where Southbound anticipation last took the discount to 35%. Stretch 13.5 if the A-ratio also mean-reverts to its 250-day mean.</w:t>
+              <w:t>SMIC GC. Nexchip: none until designated; ask the desk to flag the December list the day it is published (~2 weeks before effect).</w:t>
             </w:r>
           </w:p>
         </w:tc>
@@ -7110,7 +8318,7 @@
                 <w:b/>
                 <w:sz w:val="19"/>
               </w:rPr>
-              <w:t>Stop</w:t>
+              <w:t>Catalysts</w:t>
             </w:r>
           </w:p>
         </w:tc>
@@ -7124,7 +8332,7 @@
               <w:rPr>
                 <w:sz w:val="19"/>
               </w:rPr>
-              <w:t>20.5 (+15%) on the ratio, or GigaDevice’s A/H premium widening past 15% (means Southbound is re-crowding the H — the thesis is wrong for now).</w:t>
+              <w:t>Late-Sep TrendForce Q4 outlook · late-Oct A-share Q3 reports · mid-Dec HKEX designation review · 10 Jan 2027 Nexchip unlock.</w:t>
             </w:r>
           </w:p>
         </w:tc>
@@ -7142,7 +8350,7 @@
                 <w:b/>
                 <w:sz w:val="19"/>
               </w:rPr>
-              <w:t>Horizon / time stop</w:t>
+              <w:t>Kill switches</w:t>
             </w:r>
           </w:p>
         </w:tc>
@@ -7156,103 +8364,7 @@
               <w:rPr>
                 <w:sz w:val="19"/>
               </w:rPr>
-              <w:t>Into the 7 Dec inclusion; be flat before 10 Jan 2027 (cornerstone unlock on the long leg).</w:t>
-            </w:r>
-          </w:p>
-        </w:tc>
-      </w:tr>
-      <w:tr>
-        <w:tc>
-          <w:tcPr>
-            <w:tcW w:type="dxa" w:w="2551"/>
-            <w:shd w:val="clear" w:color="auto" w:fill="E8EEF5"/>
-          </w:tcPr>
-          <w:p>
-            <w:r/>
-            <w:r>
-              <w:rPr>
-                <w:b/>
-                <w:sz w:val="19"/>
-              </w:rPr>
-              <w:t>Borrow</w:t>
-            </w:r>
-          </w:p>
-        </w:tc>
-        <w:tc>
-          <w:tcPr>
-            <w:tcW w:type="dxa" w:w="7087"/>
-          </w:tcPr>
-          <w:p>
-            <w:r/>
-            <w:r>
-              <w:rPr>
-                <w:sz w:val="19"/>
-              </w:rPr>
-              <w:t>GigaDevice should be designated (verify). Lendable float excludes Southbound holdings, so the pool is smaller than HK$16bn — budget 1–3% and check the rate before sizing.</w:t>
-            </w:r>
-          </w:p>
-        </w:tc>
-      </w:tr>
-      <w:tr>
-        <w:tc>
-          <w:tcPr>
-            <w:tcW w:type="dxa" w:w="2551"/>
-            <w:shd w:val="clear" w:color="auto" w:fill="E8EEF5"/>
-          </w:tcPr>
-          <w:p>
-            <w:r/>
-            <w:r>
-              <w:rPr>
-                <w:b/>
-                <w:sz w:val="19"/>
-              </w:rPr>
-              <w:t>Catalysts</w:t>
-            </w:r>
-          </w:p>
-        </w:tc>
-        <w:tc>
-          <w:tcPr>
-            <w:tcW w:type="dxa" w:w="7087"/>
-          </w:tcPr>
-          <w:p>
-            <w:r/>
-            <w:r>
-              <w:rPr>
-                <w:sz w:val="19"/>
-              </w:rPr>
-              <w:t>End-Sep TrendForce Q4 DRAM/NOR contract outlook · late-Oct A-share Q3 reports (both) · ~20 Nov HSCI review announcement · Nov HKEX short-sell review (Nexchip designated → the reverse trade opens) · ~7 Dec inclusion.</w:t>
-            </w:r>
-          </w:p>
-        </w:tc>
-      </w:tr>
-      <w:tr>
-        <w:tc>
-          <w:tcPr>
-            <w:tcW w:type="dxa" w:w="2551"/>
-            <w:shd w:val="clear" w:color="auto" w:fill="E8EEF5"/>
-          </w:tcPr>
-          <w:p>
-            <w:r/>
-            <w:r>
-              <w:rPr>
-                <w:b/>
-                <w:sz w:val="19"/>
-              </w:rPr>
-              <w:t>Kill switches</w:t>
-            </w:r>
-          </w:p>
-        </w:tc>
-        <w:tc>
-          <w:tcPr>
-            <w:tcW w:type="dxa" w:w="7087"/>
-          </w:tcPr>
-          <w:p>
-            <w:r/>
-            <w:r>
-              <w:rPr>
-                <w:sz w:val="19"/>
-              </w:rPr>
-              <w:t>Nexchip Q3 gross margin below Q2 (DDIC ASP/depreciation) with no volume offset; a Nexchip A-share raise or convertible; DRAM contract prices accelerating again in Q4 (GigaDevice EPS upgrades keep coming).</w:t>
+              <w:t>Q4 contract outlook flat or down; a GigaDevice H placement (the H premium invites one); Nexchip’s A/H gap closing sharply on Southbound flow before December (then the short entry is worse — wait for the unlock instead).</w:t>
             </w:r>
           </w:p>
         </w:tc>
@@ -7277,7 +8389,7 @@
         <w:rPr>
           <w:i w:val="0"/>
         </w:rPr>
-        <w:t>Put it on, small, and treat it as a dated trade. If you only want one memory short, use SMIC as the short leg here instead (corr 0.65, spread vol 45% beta-adjusted) and keep the GigaDevice short for pair 2.</w:t>
+        <w:t>Long GigaDevice / short Nexchip is the trade; the calendar, not the thesis, is what stops you. Do not be long Nexchip for the A/H gap — the profits are falling and the buyer is already in the room.</w:t>
       </w:r>
     </w:p>
     <w:p>
@@ -7285,7 +8397,7 @@
         <w:pStyle w:val="Heading1"/>
       </w:pPr>
       <w:r>
-        <w:t>3. Pair 2 — Long Montage 6809 / Short GigaDevice 3986</w:t>
+        <w:t>3. Pair 2 — Long GigaDevice 3986 / Short Montage 6809 (into the Q4 print)</w:t>
       </w:r>
     </w:p>
     <w:p>
@@ -7302,7 +8414,7 @@
         <w:rPr>
           <w:i w:val="0"/>
         </w:rPr>
-        <w:t>Ratio Montage ÷ GigaDevice (H): 0.568 now. You want it higher.</w:t>
+        <w:t>Ratio quoted Montage ÷ GigaDevice (H): 0.568 now. You want it lower.</w:t>
       </w:r>
     </w:p>
     <w:p>
@@ -7330,10 +8442,10 @@
         <w:rPr>
           <w:b/>
         </w:rPr>
-        <w:t xml:space="preserve">Same theme, different engine. </w:t>
+        <w:t xml:space="preserve">The z-score is a trap, and it is worth saying why. </w:t>
       </w:r>
       <w:r>
-        <w:t>Both are “China memory”, and the market trades them together (correlation 0.82 over 40 days, 0.73 since February). But GigaDevice’s earnings move with the DDR4/NOR contract price; Montage’s move with units and content — DDR5 penetration in servers, RCD generation upgrades (each gen carries a higher ASP), MRCD/MDB for MRDIMM in AI servers, PCIe 5/6 retimers, CKD on the client side. One is a price cycle, the other is an AI-server bill-of-materials line.</w:t>
+        <w:t>Montage_A ÷ GigaDevice_A is 0.51 — the 12th percentile since January 2024 (mean 0.62) — and the naive read is “Montage cheap, mean-revert it”. But relative earnings moved by a factor of six (GigaDevice 1H26 net profit +10.9x, Montage +72%) while the price ratio moved by 0.8x. On earnings, Montage got MORE expensive against GigaDevice, not less: 73x vs 22x annualised. A ratio that has not moved as far as the fundamentals is not a reversion candidate.</w:t>
       </w:r>
     </w:p>
     <w:p>
@@ -7345,10 +8457,10 @@
         <w:rPr>
           <w:b/>
         </w:rPr>
-        <w:t xml:space="preserve">The market has paid for the cycle and left the content story behind. </w:t>
+        <w:t xml:space="preserve">Same theme, different engine — and the market is paying for the wrong one. </w:t>
       </w:r>
       <w:r>
-        <w:t>Montage_A ÷ GigaDevice_A averaged ~0.70 through 2025, hit 0.38 at GigaDevice’s 29-Jun blow-off, and is 0.51 now — the 12th percentile since January 2024. On the H it is 0.568 vs a 40-day range of 0.46–0.62. Trailing P/E 138x vs 190x (feed): the faster, more visible earnings stream is the cheaper one.</w:t>
+        <w:t>Both are “China memory” (0.82 correlation over 40 days) and both H-lines trade above their A (Montage 17%, GigaDevice 8.5%), so the A/H and Southbound noise cancels. GigaDevice earns off the DDR4/NOR contract price; Montage off DDR5 RCD/MRCD/MDB units and content into AI servers. Montage is the better business — and at 73x with a 31 Aug −8% reaction to a CLSA target cut it is the one whose multiple is exposed to any AI-capex wobble. GigaDevice at 22x is priced for the cycle to end.</w:t>
       </w:r>
     </w:p>
     <w:p>
@@ -7360,10 +8472,10 @@
         <w:rPr>
           <w:b/>
         </w:rPr>
-        <w:t xml:space="preserve">Price cycles roll; content ramps do not. </w:t>
+        <w:t xml:space="preserve">The trigger is dated. </w:t>
       </w:r>
       <w:r>
-        <w:t>Legacy-DRAM tightness came from supplier exit, which is a one-off step; once contract increases decelerate (the Q4 print is the first candidate) the earnings-revision momentum that carried GigaDevice reverses, and it reverses first in the H line that is priced above the A. Montage’s Q3/Q4 are driven by hyperscaler DDR5/MRDIMM builds already in backlog.</w:t>
+        <w:t>TrendForce’s Q4 conventional-DRAM contract outlook comes at the end of September. Q3 was +13–18% with supplier inventories at historic lows. If Q4 prints another double-digit increase, GigaDevice’s Q3 report (late Oct) will be a second step up and the 22x collapses toward the teens; Montage cannot match that. If Q4 is flat, reverse the pair the same day — this is a cycle-continuation trade with a quality hedge, not a valuation-normalisation trade, and it should be run two-sided.</w:t>
       </w:r>
     </w:p>
     <w:p>
@@ -7375,10 +8487,10 @@
         <w:rPr>
           <w:b/>
         </w:rPr>
-        <w:t xml:space="preserve">The A/H component cancels. </w:t>
+        <w:t xml:space="preserve">Tradeable. </w:t>
       </w:r>
       <w:r>
-        <w:t>Both H-lines trade above their A (Montage −17%, GigaDevice −8.5%), both are Southbound names with HK$1bn+ daily turnover, both are designated for shorting. That is why this pair is cleaner than pair 1: it is one bet (cycle vs content), not two.</w:t>
+        <w:t>Both designated, both Southbound, HK$1.0–1.5bn a day each, vols 119% / 100% over 40 days so dollar-neutral is close to beta-neutral (0.98).</w:t>
       </w:r>
     </w:p>
     <w:tbl>
@@ -7632,7 +8744,7 @@
                 <w:b/>
                 <w:sz w:val="16"/>
               </w:rPr>
-              <w:t>H since 9 Feb (140d)</w:t>
+              <w:t>Montage/GigaDevice H since 9 Feb</w:t>
             </w:r>
           </w:p>
         </w:tc>
@@ -7820,7 +8932,7 @@
                 <w:b/>
                 <w:sz w:val="16"/>
               </w:rPr>
-              <w:t>H last 40d</w:t>
+              <w:t>Montage/GigaDevice H 40d</w:t>
             </w:r>
           </w:p>
         </w:tc>
@@ -8017,7 +9129,7 @@
                 <w:b/>
                 <w:sz w:val="16"/>
               </w:rPr>
-              <w:t>A-shares since Jan-24</w:t>
+              <w:t>Montage/GigaDevice A since Jan-24</w:t>
             </w:r>
           </w:p>
         </w:tc>
@@ -8205,7 +9317,7 @@
                 <w:b/>
                 <w:sz w:val="16"/>
               </w:rPr>
-              <w:t>A-shares last 250d</w:t>
+              <w:t>Montage/GigaDevice A 250d</w:t>
             </w:r>
           </w:p>
         </w:tc>
@@ -8433,7 +9545,7 @@
               <w:rPr>
                 <w:sz w:val="19"/>
               </w:rPr>
-              <w:t>Long Montage HK$20m / short GigaDevice HK$20m, dollar-neutral (40-day beta 0.98, vols 119% / 100%). Both legs are a click at this size.</w:t>
+              <w:t>Long GigaDevice HK$20m / short Montage HK$20m, dollar-neutral.</w:t>
             </w:r>
           </w:p>
         </w:tc>
@@ -8465,7 +9577,7 @@
               <w:rPr>
                 <w:sz w:val="19"/>
               </w:rPr>
-              <w:t>Ratio ≤ 0.57 (now 0.568). Add at 0.52 if it gets there without news.</w:t>
+              <w:t>Ratio ≥ 0.55 (now 0.568); it printed 0.62 on 21 Aug — scale the second half there if it comes before the TrendForce release.</w:t>
             </w:r>
           </w:p>
         </w:tc>
@@ -8497,7 +9609,7 @@
               <w:rPr>
                 <w:sz w:val="19"/>
               </w:rPr>
-              <w:t>0.70 (+23%) — the 2025 average of the A-share ratio, i.e. the pre-cycle relationship. Take half at 0.64.</w:t>
+              <w:t>0.46 (−19%): the 40-day low; stretch 0.40 (the 29-Jun print was 0.36).</w:t>
             </w:r>
           </w:p>
         </w:tc>
@@ -8529,7 +9641,7 @@
               <w:rPr>
                 <w:sz w:val="19"/>
               </w:rPr>
-              <w:t>0.47 (−17%): the 40-day low (0.464) and below the post-June rebound base.</w:t>
+              <w:t>0.64 (+13%) on the ratio, or an automatic flip to long Montage / short GigaDevice if the Q4 outlook is ≤ +5%.</w:t>
             </w:r>
           </w:p>
         </w:tc>
@@ -8561,7 +9673,7 @@
               <w:rPr>
                 <w:sz w:val="19"/>
               </w:rPr>
-              <w:t>3–6 months, through two quarterly prints and one TrendForce quarter-end.</w:t>
+              <w:t>Into the late-Oct Q3 reports; reassess at the Q1-27 contract outlook (late Dec).</w:t>
             </w:r>
           </w:p>
         </w:tc>
@@ -8593,7 +9705,7 @@
               <w:rPr>
                 <w:sz w:val="19"/>
               </w:rPr>
-              <w:t>GigaDevice as above; Montage no borrow needed. Both H floats are Southbound-held — check the lendable pool, not the float.</w:t>
+              <w:t>Montage designated; float HK$21bn but Southbound-held, so check the lendable quantity rather than assuming GC.</w:t>
             </w:r>
           </w:p>
         </w:tc>
@@ -8625,7 +9737,7 @@
               <w:rPr>
                 <w:sz w:val="19"/>
               </w:rPr>
-              <w:t>End-Sep TrendForce Q4 contract-price outlook (the trigger) · late-Oct Q3 reports · DDR4 EOL/allocation headlines from Samsung/Hynix/Micron · hyperscaler capex updates (Oct/Nov earnings) · MRDIMM adoption news.</w:t>
+              <w:t>Late-Sep TrendForce Q4 outlook (the gate) · DDR4 allocation/EOL headlines from Samsung, Hynix, Micron · late-Oct Q3 prints · hyperscaler capex updates (Oct/Nov).</w:t>
             </w:r>
           </w:p>
         </w:tc>
@@ -8657,7 +9769,7 @@
               <w:rPr>
                 <w:sz w:val="19"/>
               </w:rPr>
-              <w:t>Q4 DRAM contract prices re-accelerating (+20% or more); GigaDevice sourcing its own DDR4/LPDDR4 capacity at fixed cost (turns it from renter to owner); Montage guiding a customer inventory digestion; a Montage placement.</w:t>
+              <w:t>Q4 outlook flat; a GigaDevice placement into the H premium; Montage announcing a large buyback or a new MRDIMM customer that re-rates it independently of memory pricing.</w:t>
             </w:r>
           </w:p>
         </w:tc>
@@ -8682,7 +9794,7 @@
         <w:rPr>
           <w:i w:val="0"/>
         </w:rPr>
-        <w:t>Best risk/reward in the note: high correlation, similar vols, no A/H noise, a dated catalyst. If you run only one memory pair, run this one.</w:t>
+        <w:t>The best-defined trade in the note because it has a date and a two-sided plan. If you only run one memory position, run this one and treat pair 1 as the December follow-on.</w:t>
       </w:r>
     </w:p>
     <w:p>
@@ -8707,7 +9819,7 @@
         <w:rPr>
           <w:i w:val="0"/>
         </w:rPr>
-        <w:t>Ratio Hua Hong ÷ SMIC (H): 1.685 now. You want it lower — but not from here; wait for a bounce.</w:t>
+        <w:t>Ratio Hua Hong ÷ SMIC (H): 1.685 now. You want it lower — from a bounce, not from here.</w:t>
       </w:r>
     </w:p>
     <w:p>
@@ -8738,7 +9850,7 @@
         <w:t xml:space="preserve">Hua Hong re-rated 4x against SMIC in eighteen months. </w:t>
       </w:r>
       <w:r>
-        <w:t>Hua Hong_A ÷ SMIC_A went 0.49 (Dec-24) → 2.12 (Jun-26); on the H the ratio peaked at 2.45 on 7 Jul. It was a capacity-scarcity story — mature-node price hikes, 12-inch utilisation, the parent asset-consolidation narrative — and the whole A/H semis crowd was in it.</w:t>
+        <w:t>Hua Hong_A ÷ SMIC_A went 0.49 (Dec-24) → 2.12 (Jun-26); on the H the ratio peaked at 2.45 on 7 Jul. The story was mature-node scarcity — price hikes, full 12-inch fabs, the parent-consolidation narrative — and the whole A/H semis crowd was in it.</w:t>
       </w:r>
     </w:p>
     <w:p>
@@ -8750,10 +9862,10 @@
         <w:rPr>
           <w:b/>
         </w:rPr>
-        <w:t xml:space="preserve">Earnings cannot hold that. </w:t>
+        <w:t xml:space="preserve">The prints are good and still do not carry the multiple. </w:t>
       </w:r>
       <w:r>
-        <w:t>Hua Hong is 468x trailing on the H (feed): ~HK$200bn of market cap on roughly HK$0.4bn of earnings, because the new 12-inch fab’s depreciation sits on the P&amp;L for years and single-digit price hikes do not move a low-teens gross margin enough. SMIC is 110x trailing on the same feed, and its demand is the structural one in China semis — every domestic AI accelerator is made at SMIC’s advanced nodes, and that capacity is the bottleneck of the whole domestic AI build.</w:t>
+        <w:t>Hua Hong 1H26 net profit US$59.6m, +409% on record revenue; Q2 beat and the Q3 guide was positive (Citi raised estimates). Annualise it and the H-share is 215x. SMIC 1H26 net profit US$677m, +111%; Q2 revenue above US$3bn, +20% QoQ, taking foundry share to 5.4% against Samsung’s 5.9% (TrendForce, 9 Sep) — 55x annualised. Hua Hong Group’s Q2 revenue grew 3.5% QoQ in the same table. The fast-growing, share-gaining one is the cheap one by four times.</w:t>
       </w:r>
     </w:p>
     <w:p>
@@ -8765,10 +9877,10 @@
         <w:rPr>
           <w:b/>
         </w:rPr>
-        <w:t xml:space="preserve">The ratio has already turned, which is the problem and the opportunity. </w:t>
+        <w:t xml:space="preserve">The ratio has already turned. </w:t>
       </w:r>
       <w:r>
-        <w:t>From the 7-Jul peak: Hua Hong −44%, SMIC −20%; the ratio is 1.69 vs a 40-day mean of 1.91 (z −1.1). It is still the 88th percentile since 2024 (mean 1.06) and 91st on the A-shares — so the long-run says more to come, the short-run says you are late. Resolution: scale in on a bounce toward 1.85–2.00, which the sector gives you roughly every three weeks.</w:t>
+        <w:t>From the 7-Jul peak Hua Hong is −44%, SMIC −20%; the ratio is 1.69 vs a 40-day mean of 1.91 (z −1.1) but still the 88th percentile since 2024 (mean 1.06) and 91st on the A-shares. Long-run says more to come, short-run says you are late — so stage it: a third now, the rest at 1.85–2.00, which the sector gives you about every three weeks.</w:t>
       </w:r>
     </w:p>
     <w:p>
@@ -8780,10 +9892,10 @@
         <w:rPr>
           <w:b/>
         </w:rPr>
-        <w:t xml:space="preserve">Vol asymmetry makes the pair net-short sector vol. </w:t>
+        <w:t xml:space="preserve">Vol asymmetry makes it net-short sector vol. </w:t>
       </w:r>
       <w:r>
-        <w:t>Hua Hong runs 99% 60-day vol vs SMIC 60%. Vol-neutral sizing (0.6 of Hua Hong per 1.0 of SMIC) means the pair pays in a further de-rating and roughly holds in a bounce — you are short the melt-up scenario, which is the one you already believe is over.</w:t>
+        <w:t>Hua Hong runs 99% 60-day vol, SMIC 60%. At 0.6 of Hua Hong per 1.0 of SMIC the pair pays in a further de-rating and roughly holds in a bounce.</w:t>
       </w:r>
     </w:p>
     <w:p>
@@ -8795,10 +9907,10 @@
         <w:rPr>
           <w:b/>
         </w:rPr>
-        <w:t xml:space="preserve">The counter-argument, stated. </w:t>
+        <w:t xml:space="preserve">What argues against, stated. </w:t>
       </w:r>
       <w:r>
-        <w:t>On A/H terms Hua Hong’s H is at the cheap end of its own range (127% A-premium vs a 36–190% range, mean 98%) while SMIC’s H is at the rich end (112% vs 85–335%, mean 163%). If A/H premia mean-revert through the A falling, that is neutral for this pair; if through the H rising, it hurts. It is why the entry is on a bounce and the size is normal, not large.</w:t>
+        <w:t>TrendForce’s Q3 foundry note says mature-process capacity “could remain constrained and wafer prices may rise” — that is Hua Hong’s story continuing. On A/H terms Hua Hong’s H is at the cheap end of its own range (127% premium vs 36–190%) while SMIC’s is at the rich end (112% vs 85–335%). And Southbound has been selling both. None of it changes the direction; all of it argues for the staged entry and normal, not large, size.</w:t>
       </w:r>
     </w:p>
     <w:tbl>
@@ -9052,7 +10164,7 @@
                 <w:b/>
                 <w:sz w:val="16"/>
               </w:rPr>
-              <w:t>H since Jan-24 (658d)</w:t>
+              <w:t>Hua Hong/SMIC H since Jan-24</w:t>
             </w:r>
           </w:p>
         </w:tc>
@@ -9240,7 +10352,7 @@
                 <w:b/>
                 <w:sz w:val="16"/>
               </w:rPr>
-              <w:t>H last 40d</w:t>
+              <w:t>Hua Hong/SMIC H 40d</w:t>
             </w:r>
           </w:p>
         </w:tc>
@@ -9437,7 +10549,7 @@
                 <w:b/>
                 <w:sz w:val="16"/>
               </w:rPr>
-              <w:t>A-shares since Jan-24</w:t>
+              <w:t>Hua Hong/SMIC A since Jan-24</w:t>
             </w:r>
           </w:p>
         </w:tc>
@@ -9625,7 +10737,7 @@
                 <w:b/>
                 <w:sz w:val="16"/>
               </w:rPr>
-              <w:t>A-shares last 250d</w:t>
+              <w:t>Hua Hong/SMIC A 250d</w:t>
             </w:r>
           </w:p>
         </w:tc>
@@ -9853,7 +10965,7 @@
               <w:rPr>
                 <w:sz w:val="19"/>
               </w:rPr>
-              <w:t>Long SMIC HK$30m / short Hua Hong HK$18m (vol-neutral 0.6:1). Both trade HK$4–5bn a day; borrow is GC.</w:t>
+              <w:t>Long SMIC HK$30m / short Hua Hong HK$18m (vol-neutral 0.6:1). Both HK$4–5bn a day, GC borrow.</w:t>
             </w:r>
           </w:p>
         </w:tc>
@@ -9885,7 +10997,7 @@
               <w:rPr>
                 <w:sz w:val="19"/>
               </w:rPr>
-              <w:t>One-third now at 1.69; the rest at ≥ 1.85. Full position only if the bounce comes without a Hua Hong-specific catalyst (deal terms, guidance).</w:t>
+              <w:t>One-third at 1.69; the rest at ≥ 1.85 if the bounce comes without a Hua Hong-specific catalyst.</w:t>
             </w:r>
           </w:p>
         </w:tc>
@@ -9917,7 +11029,7 @@
               <w:rPr>
                 <w:sz w:val="19"/>
               </w:rPr>
-              <w:t>1.30 (−23% from here): the May level, and roughly the point where Hua Hong’s premium to SMIC matches its 2025 average relationship.</w:t>
+              <w:t>1.30 (−23%): the May level.</w:t>
             </w:r>
           </w:p>
         </w:tc>
@@ -9949,7 +11061,7 @@
               <w:rPr>
                 <w:sz w:val="19"/>
               </w:rPr>
-              <w:t>2.10 on the ratio (a new leg of the Hua Hong story), or a Hua Hong Q3 gross-margin guide above 15% with rising utilisation — that would mean the price hikes are real earnings.</w:t>
+              <w:t>2.10 on the ratio, or Hua Hong guiding Q4 gross margin up with rising utilisation at its ~6 Nov print.</w:t>
             </w:r>
           </w:p>
         </w:tc>
@@ -9981,7 +11093,7 @@
               <w:rPr>
                 <w:sz w:val="19"/>
               </w:rPr>
-              <w:t>3–6 months, through the November Q3 prints (Hua Hong ~6 Nov, SMIC ~12 Nov — both guide the next quarter).</w:t>
+              <w:t>3–6 months through the November Q3 prints (Hua Hong ~6 Nov, SMIC ~12 Nov).</w:t>
             </w:r>
           </w:p>
         </w:tc>
@@ -10013,7 +11125,7 @@
               <w:rPr>
                 <w:sz w:val="19"/>
               </w:rPr>
-              <w:t>Q3 results and Q4 guides (Nov) · terms of the parent asset injection (dilution vs accretion) · mature-node pricing commentary from TSMC/UMC/Vanguard (Oct) · export-control headlines (hit SMIC harder — the one asymmetric risk to the long leg).</w:t>
+              <w:t>Q3 results and Q4 guides (Nov) · terms and timing of the parent asset injection · mature-node pricing commentary from TSMC/UMC/Vanguard (Oct) · export-control headlines (hit SMIC harder — the asymmetric risk to the long leg).</w:t>
             </w:r>
           </w:p>
         </w:tc>
@@ -10045,7 +11157,7 @@
               <w:rPr>
                 <w:sz w:val="19"/>
               </w:rPr>
-              <w:t>Asset injection announced at an accretive price with an aggressive timetable; 8-inch/12-inch price hikes accelerating (&gt;10%); an SMIC-specific US action; SMIC equity raise.</w:t>
+              <w:t>Asset injection at an accretive price with a fast timetable; another round of 8-inch/12-inch price hikes above 10%; an SMIC-specific US action; SMIC equity raise.</w:t>
             </w:r>
           </w:p>
         </w:tc>
@@ -10070,7 +11182,7 @@
         <w:rPr>
           <w:i w:val="0"/>
         </w:rPr>
-        <w:t>Right direction, wrong moment — the 40-day move already did a third of the work. Stage the entry and let the sector’s next bounce set the size.</w:t>
+        <w:t>Right direction, wrong moment — the 40-day move did a third of the work and Hua Hong’s own print was good. Stage it and let the next sector bounce set the size.</w:t>
       </w:r>
     </w:p>
     <w:p>
@@ -10123,10 +11235,25 @@
         <w:rPr>
           <w:b/>
         </w:rPr>
+        <w:t xml:space="preserve">The August prints point the same way as the thesis. </w:t>
+      </w:r>
+      <w:r>
+        <w:t>Innoscience 1H26: revenue RMB834m +51%, gross margin 11.6% (+4.8pts), loss narrowed to RMB309m from RMB429m. SICC 1H26: revenue RMB914m +15%, swung to a RMB58.6m loss from a small profit — volume up, price down. One has expanding margins, one contracting, on similar revenue.</w:t>
+      </w:r>
+    </w:p>
+    <w:p>
+      <w:pPr>
+        <w:pStyle w:val="ListNumber"/>
+        <w:spacing w:after="40"/>
+      </w:pPr>
+      <w:r>
+        <w:rPr>
+          <w:b/>
+        </w:rPr>
         <w:t xml:space="preserve">SiC substrates are a commodity with a Chinese supply curve. </w:t>
       </w:r>
       <w:r>
-        <w:t>Capacity from SICC, TankeBlue, SanAn and a dozen others tripled in three years; 6-inch prices have more than halved since 2023 and 8-inch is the next front. Wolfspeed’s 2025 restructuring is what it looks like when even the leader cannot earn its cost of capital. SICC’s growth is volume at falling ASP — revenue up, margin down, and its overseas customers (near half of sales) are the ones squeezing hardest as they dual-source.</w:t>
+        <w:t>SICC has the share (27.6% in 2025, 51% of 8-inch, per CMBI’s initiation) and it still cannot make money, because capacity across SICC, TankeBlue, SanAn and others tripled in three years and 8-inch is the next price front. Wolfspeed’s 2025 restructuring is what the leader looks like in this market. SICC’s overseas customers — near half of sales — are the ones dual-sourcing and squeezing.</w:t>
       </w:r>
     </w:p>
     <w:p>
@@ -10141,7 +11268,7 @@
         <w:t xml:space="preserve">GaN is on the other side of its curve. </w:t>
       </w:r>
       <w:r>
-        <w:t>Penetration is rising, not saturating: fast chargers → data-centre 48V/800V power stages → auto → motor drives/humanoids. Innoscience is the volume leader on 8-inch GaN-on-Si, gross margin has crossed into positive territory and losses are narrowing — the operating leverage runs its way, and the AI-server power-architecture roadmaps (800V DC) put GaN in the bill of materials at exactly the point the market has stopped paying for it.</w:t>
+        <w:t>Fast chargers → data-centre 48V/800V power stages → auto → motor drives. Innoscience is the volume leader on 8-inch GaN-on-Si, the operating leverage is now visible in the print, it just won a patent round (CLSA: “proves independent innovation capability”), and Daiwa initiated at Buy on data-centre GaN. Broker targets sit at HK$74–112 against a HK$44.5 price after the sector unwind.</w:t>
       </w:r>
     </w:p>
     <w:p>
@@ -10153,10 +11280,10 @@
         <w:rPr>
           <w:b/>
         </w:rPr>
-        <w:t xml:space="preserve">The ratio says the market has it backwards. </w:t>
+        <w:t xml:space="preserve">Price says the market has it backwards. </w:t>
       </w:r>
       <w:r>
-        <w:t>0.67 vs a one-year mean of 1.03; 14th percentile since SICC listed. Both are loss-makers on the feed, both roughly HK$30–40bn of enterprise value on ~RMB 2bn of revenue — one with expanding margins, one with contracting.</w:t>
+        <w:t>Ratio 0.67 vs a one-year mean of 1.03, 14th percentile since SICC listed. On annualised 1H26 sales the H-shares are ~21x (Innoscience) vs ~15x (SICC) — you pay a third more for the one growing three times faster with margins going the right way. SICC also carries a 76% A-premium, so its H is the cheap line vs the mainland; that is the one thing to respect on the short.</w:t>
       </w:r>
     </w:p>
     <w:p>
@@ -10171,7 +11298,7 @@
         <w:t xml:space="preserve">Tradeable. </w:t>
       </w:r>
       <w:r>
-        <w:t>Both are designated and Southbound-eligible, both do ~HK$200m a day, SICC’s lock-ups are long expired. 40-day correlation 0.67, vols 67% / 83%.</w:t>
+        <w:t>Both designated and Southbound, ~HK$200m a day each, lock-ups expired. 40-day correlation 0.67, vols 67% / 83%.</w:t>
       </w:r>
     </w:p>
     <w:tbl>
@@ -10425,7 +11552,7 @@
                 <w:b/>
                 <w:sz w:val="16"/>
               </w:rPr>
-              <w:t>H since 20 Aug-25 (257d)</w:t>
+              <w:t>Innoscience/SICC H since 20 Aug-25</w:t>
             </w:r>
           </w:p>
         </w:tc>
@@ -10613,7 +11740,7 @@
                 <w:b/>
                 <w:sz w:val="16"/>
               </w:rPr>
-              <w:t>H last 40d</w:t>
+              <w:t>Innoscience/SICC H 40d</w:t>
             </w:r>
           </w:p>
         </w:tc>
@@ -11001,7 +12128,7 @@
               <w:rPr>
                 <w:sz w:val="19"/>
               </w:rPr>
-              <w:t>SICC Q3 (late Oct) — ASP and gross margin, not revenue · Innoscience 2H trading updates and data-centre design-win announcements · Infineon/onsemi/ST SiC pricing commentary (Oct/Nov) · any SiC capacity closure headlines.</w:t>
+              <w:t>SICC Q3 (late Oct) — ASP and gross margin, not revenue · Innoscience data-centre design-win announcements and any 2H trading update · Infineon/onsemi/ST SiC pricing commentary (Oct/Nov) · SiC capacity closures.</w:t>
             </w:r>
           </w:p>
         </w:tc>
@@ -11033,7 +12160,7 @@
               <w:rPr>
                 <w:sz w:val="19"/>
               </w:rPr>
-              <w:t>The US patent cases against Innoscience (EPC/Infineon) producing an import restriction — sentiment hit even if commercially small; an Innoscience placement; an 800V-EV or AI-DC SiC demand surprise that lifts 8-inch pricing; SICC’s A-premium (76% now) compressing via the H rallying.</w:t>
+              <w:t>The remaining US patent cases (EPC/Infineon) producing an import restriction — sentiment hit even if commercially small; an Innoscience placement; an 800V-EV or AI-DC SiC demand surprise lifting 8-inch pricing; SICC’s A-premium compressing via the H rallying.</w:t>
             </w:r>
           </w:p>
         </w:tc>
@@ -11058,7 +12185,7 @@
         <w:rPr>
           <w:i w:val="0"/>
         </w:rPr>
-        <w:t>Good pair, lower liquidity than 2 and 3, so half the size. The patent docket is the risk you cannot model — keep an alert on it.</w:t>
+        <w:t>Good pair, half the liquidity of 2 and 3, so half the size. The patent docket is the risk you cannot model — keep an alert on it.</w:t>
       </w:r>
     </w:p>
     <w:p>
@@ -11067,6 +12194,41 @@
       </w:pPr>
       <w:r>
         <w:t>6. Watch list — not yet</w:t>
+      </w:r>
+    </w:p>
+    <w:p>
+      <w:pPr>
+        <w:pStyle w:val="Heading2"/>
+      </w:pPr>
+      <w:r>
+        <w:t>Iluvatar 9903 vs Biren 6082</w:t>
+      </w:r>
+    </w:p>
+    <w:p>
+      <w:pPr>
+        <w:pStyle w:val="ListBullet"/>
+        <w:spacing w:after="40"/>
+      </w:pPr>
+      <w:r>
+        <w:t>Biren ÷ Iluvatar is 0.121 — the 98th percentile of the last 40 sessions (0.061 on 28 Jul). Iluvatar is −51% from the June top and fell 11.4% on Monday with no headline behind it; Biren is +6% since mid-August.</w:t>
+      </w:r>
+    </w:p>
+    <w:p>
+      <w:pPr>
+        <w:pStyle w:val="ListBullet"/>
+        <w:spacing w:after="40"/>
+      </w:pPr>
+      <w:r>
+        <w:t>The 1H26 print explains the de-rating, not Monday: revenue RMB946m (+192% YoY, +33% HoH) but gross margin fell from 50.1% to 17.2% on reselling components below cost and inventory impairment; net profit RMB106m. Macquarie, CMBI, BofA and Morgan Stanley cut targets to HK$668–1,060 — still two to three times the price — and it was added to Hang Seng TECH at the last review. New flagship GPGPU launched 20 Jul.</w:t>
+      </w:r>
+    </w:p>
+    <w:p>
+      <w:pPr>
+        <w:pStyle w:val="ListBullet"/>
+        <w:spacing w:after="40"/>
+      </w:pPr>
+      <w:r>
+        <w:t>Mean reversion says long Iluvatar / short Biren; you do not buy an −11% day in a name with a 17% gross margin until you know whether it was index flow (Monday was rebalance day) or a block. Both designated, HK$0.5–0.8bn a day. Alert at 0.13 with the cause identified; a third of pair-2 size.</w:t>
       </w:r>
     </w:p>
     <w:p>
@@ -11083,7 +12245,7 @@
         <w:spacing w:after="40"/>
       </w:pPr>
       <w:r>
-        <w:t>Quality vs cash burn inside the same de-rated sub-sector: Horizon has volume (J6 ramp, HSD programmes), 70%-plus gross margin and a large cash pile; Black Sesame is sub-scale with a handful of customers. Both are ~58% off their autumn-2025 highs and neither joined the June melt-up.</w:t>
+        <w:t>Quality vs cash burn inside the same de-rated sub-sector. Both ~58% off their autumn-2025 highs, neither joined the June melt-up. Both are designated (verified) — but Black Sesame trades HK$54m a day on a HK$7.6bn float, so borrow will be small and special.</w:t>
       </w:r>
     </w:p>
     <w:p>
@@ -11092,7 +12254,15 @@
         <w:spacing w:after="40"/>
       </w:pPr>
       <w:r>
-        <w:t>The problem is it is not a pair: 40-day correlation 0.35 (0.46 since 2024), beta 0.25–0.37, so the short hedges very little of the long. Black Sesame’s H float is HK$7.6bn and it trades HK$54m a day — borrow will be small and special.</w:t>
+        <w:t>It is not a pair: 40-day correlation 0.35, beta 0.25–0.37. Ratio 0.414, 70th percentile since Oct-24. Do it as long Horizon with a HSTECH hedge unless borrow is genuinely there. Neither name’s 1H26 print was checked for this note.</w:t>
+      </w:r>
+    </w:p>
+    <w:p>
+      <w:pPr>
+        <w:pStyle w:val="Heading2"/>
+      </w:pPr>
+      <w:r>
+        <w:t>OmniVision 501 / Gpixel 3277 — dead</w:t>
       </w:r>
     </w:p>
     <w:p>
@@ -11101,7 +12271,7 @@
         <w:spacing w:after="40"/>
       </w:pPr>
       <w:r>
-        <w:t>Ratio 0.414, 70th percentile since Oct-24 (0.34 mean); this is a trend trade, not a reversion. Do it as a long Horizon with a HSTECH hedge unless borrow is genuinely there.</w:t>
+        <w:t>The valuation gap is real (20x vs 115x trailing, CIS leader vs machine-vision niche) but Gpixel is not on the designated list, so the pair does not exist. OmniVision on its own — 20x, 30% A-discount, designated, Southbound, but only HK$30m a day — is a long candidate against the SMIC hedge for small size.</w:t>
       </w:r>
     </w:p>
     <w:p>
@@ -11109,7 +12279,7 @@
         <w:pStyle w:val="Heading2"/>
       </w:pPr>
       <w:r>
-        <w:t>Iluvatar 9903 vs Biren 6082</w:t>
+        <w:t>SG Micro 3661 / Novosense 2676</w:t>
       </w:r>
     </w:p>
     <w:p>
@@ -11118,77 +12288,7 @@
         <w:spacing w:after="40"/>
       </w:pPr>
       <w:r>
-        <w:t>Biren ÷ Iluvatar is 0.121 — the 98th percentile of the last 40 sessions (0.061 on 28 Jul). Iluvatar is −51% from the June top and fell 11.4% on Monday alone; Biren is +6% since mid-August.</w:t>
-      </w:r>
-    </w:p>
-    <w:p>
-      <w:pPr>
-        <w:pStyle w:val="ListBullet"/>
-        <w:spacing w:after="40"/>
-      </w:pPr>
-      <w:r>
-        <w:t>Mean reversion says long Iluvatar / short Biren. You do not buy an −11% day in a loss-making GPU name without knowing why — both cornerstone lock-ups expired in early July, so a pre-IPO block or placement is the first thing to rule out; if it was index flow (Monday was rebalance day), the ratio reverses on its own.</w:t>
-      </w:r>
-    </w:p>
-    <w:p>
-      <w:pPr>
-        <w:pStyle w:val="ListBullet"/>
-        <w:spacing w:after="40"/>
-      </w:pPr>
-      <w:r>
-        <w:t>Set the alert at 0.13 with the cause identified. Correlation 0.64, vols 107% / 130% — size at a third of pair 2.</w:t>
-      </w:r>
-    </w:p>
-    <w:p>
-      <w:pPr>
-        <w:pStyle w:val="Heading2"/>
-      </w:pPr>
-      <w:r>
-        <w:t>Long OmniVision 501 / short Gpixel 3277</w:t>
-      </w:r>
-    </w:p>
-    <w:p>
-      <w:pPr>
-        <w:pStyle w:val="ListBullet"/>
-        <w:spacing w:after="40"/>
-      </w:pPr>
-      <w:r>
-        <w:t>20x vs 115x trailing (feed) for two CIS names: the smartphone/auto leader at a 30% discount to its A, against an industrial machine-vision niche that ran to 111 on 30 Jun and is −24% since.</w:t>
-      </w:r>
-    </w:p>
-    <w:p>
-      <w:pPr>
-        <w:pStyle w:val="ListBullet"/>
-        <w:spacing w:after="40"/>
-      </w:pPr>
-      <w:r>
-        <w:t>Not a pair either: correlation 0.31, and the long leg trades HK$30m a day on a HK$3.7bn H float. Gpixel should be designated via the fast-track (float HK$25bn) — verify.</w:t>
-      </w:r>
-    </w:p>
-    <w:p>
-      <w:pPr>
-        <w:pStyle w:val="ListBullet"/>
-        <w:spacing w:after="40"/>
-      </w:pPr>
-      <w:r>
-        <w:t>Best used as “sell Gpixel on strength above 95” with OmniVision as the sector long you already want to own for the A/H convergence.</w:t>
-      </w:r>
-    </w:p>
-    <w:p>
-      <w:pPr>
-        <w:pStyle w:val="Heading2"/>
-      </w:pPr>
-      <w:r>
-        <w:t>Long SG Micro 3661 / short Novosense 2676</w:t>
-      </w:r>
-    </w:p>
-    <w:p>
-      <w:pPr>
-        <w:pStyle w:val="ListBullet"/>
-        <w:spacing w:after="40"/>
-      </w:pPr>
-      <w:r>
-        <w:t>Analog pair, profitable vs loss-making, ratio 0.563 at the 8th percentile since June (A-share ratio mid-range). But both trade HK$40–60m a day, Novosense’s H sits at an 80% A-discount (the H is the cheap line — bad to be short if premia compress), and SG Micro’s own six-month unlock is 26 Dec. Park it.</w:t>
+        <w:t>Analog pair, profitable vs loss-making, ratio at the 8th percentile since June. Both trade HK$40–60m a day, Novosense’s H sits at an 80% A-discount (the cheap line — bad to be short if premia compress), and SG Micro’s own unlock is 26 Dec. Parked.</w:t>
       </w:r>
     </w:p>
     <w:p>
@@ -11304,7 +12404,7 @@
               <w:rPr>
                 <w:sz w:val="17"/>
               </w:rPr>
-              <w:t>Pairs 1, 2 (the trigger)</w:t>
+              <w:t>Pairs 1, 2 — the gate</w:t>
             </w:r>
           </w:p>
         </w:tc>
@@ -11322,7 +12422,7 @@
                 <w:b/>
                 <w:sz w:val="17"/>
               </w:rPr>
-              <w:t>~8 Oct</w:t>
+              <w:t>late Oct</w:t>
             </w:r>
           </w:p>
         </w:tc>
@@ -11337,7 +12437,7 @@
               <w:rPr>
                 <w:sz w:val="17"/>
               </w:rPr>
-              <w:t>Nexchip passes 60 trading days listed — enters the pool for the November short-sell review</w:t>
+              <w:t>A-share Q3 reports: Nexchip, GigaDevice, Montage, SICC, SG Micro, Novosense (by 31 Oct)</w:t>
             </w:r>
           </w:p>
         </w:tc>
@@ -11352,7 +12452,7 @@
               <w:rPr>
                 <w:sz w:val="17"/>
               </w:rPr>
-              <w:t>Pair 1 (reverse trade timing)</w:t>
+              <w:t>All</w:t>
             </w:r>
           </w:p>
         </w:tc>
@@ -11369,7 +12469,7 @@
                 <w:b/>
                 <w:sz w:val="17"/>
               </w:rPr>
-              <w:t>late Oct</w:t>
+              <w:t>~6 Nov / ~12 Nov</w:t>
             </w:r>
           </w:p>
         </w:tc>
@@ -11383,7 +12483,7 @@
               <w:rPr>
                 <w:sz w:val="17"/>
               </w:rPr>
-              <w:t>A-share Q3 reports: Nexchip, GigaDevice, Montage, SICC, SG Micro, Novosense (by 31 Oct)</w:t>
+              <w:t>Hua Hong / SMIC Q3 results with Q4 guides</w:t>
             </w:r>
           </w:p>
         </w:tc>
@@ -11397,7 +12497,7 @@
               <w:rPr>
                 <w:sz w:val="17"/>
               </w:rPr>
-              <w:t>All</w:t>
+              <w:t>Pair 3</w:t>
             </w:r>
           </w:p>
         </w:tc>
@@ -11415,7 +12515,7 @@
                 <w:b/>
                 <w:sz w:val="17"/>
               </w:rPr>
-              <w:t>~6 Nov / ~12 Nov</w:t>
+              <w:t>~20 Nov</w:t>
             </w:r>
           </w:p>
         </w:tc>
@@ -11430,7 +12530,7 @@
               <w:rPr>
                 <w:sz w:val="17"/>
               </w:rPr>
-              <w:t>Hua Hong / SMIC Q3 results with Q4 guides</w:t>
+              <w:t>Hang Seng Composite December review announced (Ingenic Southbound candidate)</w:t>
             </w:r>
           </w:p>
         </w:tc>
@@ -11445,7 +12545,7 @@
               <w:rPr>
                 <w:sz w:val="17"/>
               </w:rPr>
-              <w:t>Pair 3</w:t>
+              <w:t>Sector supply</w:t>
             </w:r>
           </w:p>
         </w:tc>
@@ -11462,7 +12562,7 @@
                 <w:b/>
                 <w:sz w:val="17"/>
               </w:rPr>
-              <w:t>mid–late Nov</w:t>
+              <w:t>7 Dec</w:t>
             </w:r>
           </w:p>
         </w:tc>
@@ -11476,7 +12576,7 @@
               <w:rPr>
                 <w:sz w:val="17"/>
               </w:rPr>
-              <w:t>HKEX quarterly short-sell designation review (Nexchip, SG Micro, CFMEE candidates)</w:t>
+              <w:t>HSI review effective (Monday after first Friday) — Southbound changes go live</w:t>
             </w:r>
           </w:p>
         </w:tc>
@@ -11490,7 +12590,7 @@
               <w:rPr>
                 <w:sz w:val="17"/>
               </w:rPr>
-              <w:t>Pair 1, watch list</w:t>
+              <w:t>Flows</w:t>
             </w:r>
           </w:p>
         </w:tc>
@@ -11508,7 +12608,7 @@
                 <w:b/>
                 <w:sz w:val="17"/>
               </w:rPr>
-              <w:t>~20 Nov</w:t>
+              <w:t>mid-Dec</w:t>
             </w:r>
           </w:p>
         </w:tc>
@@ -11523,7 +12623,7 @@
               <w:rPr>
                 <w:sz w:val="17"/>
               </w:rPr>
-              <w:t>Hang Seng Composite December review announced (Nexchip Southbound inclusion)</w:t>
+              <w:t>HKEX quarterly short-sell designation review (last one took effect 11 Sep) — Nexchip, SG Micro, CFMEE, Gpixel candidates</w:t>
             </w:r>
           </w:p>
         </w:tc>
@@ -11538,7 +12638,7 @@
               <w:rPr>
                 <w:sz w:val="17"/>
               </w:rPr>
-              <w:t>Pair 1</w:t>
+              <w:t>Pair 1 — the real short opens</w:t>
             </w:r>
           </w:p>
         </w:tc>
@@ -11555,7 +12655,7 @@
                 <w:b/>
                 <w:sz w:val="17"/>
               </w:rPr>
-              <w:t>7 Dec</w:t>
+              <w:t>late Dec</w:t>
             </w:r>
           </w:p>
         </w:tc>
@@ -11569,7 +12669,7 @@
               <w:rPr>
                 <w:sz w:val="17"/>
               </w:rPr>
-              <w:t>HSI review effective (Monday after first Friday) — Southbound changes go live</w:t>
+              <w:t>TrendForce Q1-27 contract price outlook</w:t>
             </w:r>
           </w:p>
         </w:tc>
@@ -11583,7 +12683,7 @@
               <w:rPr>
                 <w:sz w:val="17"/>
               </w:rPr>
-              <w:t>Pair 1</w:t>
+              <w:t>Pairs 1, 2 — reassess</w:t>
             </w:r>
           </w:p>
         </w:tc>
@@ -11676,7 +12776,7 @@
               <w:rPr>
                 <w:sz w:val="17"/>
               </w:rPr>
-              <w:t>Pair 1 — be flat before</w:t>
+              <w:t>Pair 1 — the short leg’s catalyst</w:t>
             </w:r>
           </w:p>
         </w:tc>
@@ -11755,7 +12855,7 @@
         <w:t xml:space="preserve">Stop on the spread, not the leg. </w:t>
       </w:r>
       <w:r>
-        <w:t>Every stop above is a ratio level. A leg-level stop in a 100%-vol name gets you out of the hedge and leaves you naked in the other one.</w:t>
+        <w:t>Every stop above is a ratio level. A leg-level stop in a 100%-vol name takes you out of the hedge and leaves you naked in the other one.</w:t>
       </w:r>
     </w:p>
     <w:p>
@@ -11785,7 +12885,7 @@
         <w:t xml:space="preserve">Rebalance on ±15% leg drift, </w:t>
       </w:r>
       <w:r>
-        <w:t>not daily. Vol-neutral ratios assume the vols hold; if GigaDevice’s vol halves after the memory tape calms, the 0.7:1 in pair 1 becomes too small a hedge — recheck monthly.</w:t>
+        <w:t>not daily. Vol-neutral ratios assume the vols hold; if GigaDevice’s vol halves after the memory tape calms, the 0.6:1 in pair 1 becomes too small a hedge — recheck monthly.</w:t>
       </w:r>
     </w:p>
     <w:p>
@@ -11797,10 +12897,10 @@
         <w:rPr>
           <w:b/>
         </w:rPr>
-        <w:t xml:space="preserve">Do not stack the same short. </w:t>
+        <w:t xml:space="preserve">Do not stack the same long. </w:t>
       </w:r>
       <w:r>
-        <w:t>Pairs 1 and 2 are both short GigaDevice; the book’s net short in one 100%-vol name should not exceed one pair’s worth.</w:t>
+        <w:t>Pairs 1 and 2 are both long GigaDevice; the book’s net long in one 100%-vol name should not exceed one pair’s worth.</w:t>
       </w:r>
     </w:p>
     <w:p>
@@ -11815,7 +12915,7 @@
         <w:t xml:space="preserve">Check three things the morning you trade: </w:t>
       </w:r>
       <w:r>
-        <w:t>the HKEX designated-securities list (shortable or not), the borrow rate and quantity (Southbound-held floats lend badly), and whether Monday’s index-day close distorted the ratio you are entering on.</w:t>
+        <w:t>the HKEX designated list (designation is binary), the borrow rate and quantity (Southbound-held floats lend badly), and whether an index-day close distorted the ratio you are entering on.</w:t>
       </w:r>
     </w:p>
     <w:p>
@@ -11823,7 +12923,7 @@
         <w:pStyle w:val="Heading1"/>
       </w:pPr>
       <w:r>
-        <w:t>9. What in this note is measured vs what is a read</w:t>
+        <w:t>9. What in this note is measured, verified, or read</w:t>
       </w:r>
     </w:p>
     <w:p>
@@ -11838,7 +12938,7 @@
         <w:t xml:space="preserve">Measured: </w:t>
       </w:r>
       <w:r>
-        <w:t>every price, return, ratio, percentile, correlation, beta, vol, ADV, A/H premium and H float above — HKEX daily prints to 7 Sep 2026, A-shares SSE/SZSE, FX 1.1674.</w:t>
+        <w:t>every price, return, ratio, percentile, correlation, beta, vol, ADV, A/H premium and H float — HKEX daily prints to 7 Sep 2026, A-shares SSE/SZSE, FX 1.1674.</w:t>
       </w:r>
     </w:p>
     <w:p>
@@ -11850,10 +12950,25 @@
         <w:rPr>
           <w:b/>
         </w:rPr>
-        <w:t xml:space="preserve">Rule-based: </w:t>
+        <w:t xml:space="preserve">Verified against primary lists (9–11 Sep): </w:t>
       </w:r>
       <w:r>
-        <w:t>short-sell eligibility and Southbound/lock-up dates are derived from the HKEX and Hang Seng rules applied to listing dates and floats. Verify each on the exchange lists before dealing — designation is binary and the list is the only source.</w:t>
+        <w:t>short-sell designation from the HKEX lists effective 1, 10 and 11 Sep 2026 (file in _pairs_note/data); Southbound eligibility from the SZSE 港股通标的 list dated 9 Sep 2026.</w:t>
+      </w:r>
+    </w:p>
+    <w:p>
+      <w:pPr>
+        <w:pStyle w:val="ListBullet"/>
+        <w:spacing w:after="40"/>
+      </w:pPr>
+      <w:r>
+        <w:rPr>
+          <w:b/>
+        </w:rPr>
+        <w:t xml:space="preserve">Verified from results headlines (AAStocks, company announcements): </w:t>
+      </w:r>
+      <w:r>
+        <w:t>1H26 prints for GigaDevice, Montage, Nexchip, SMIC, Hua Hong, Innoscience, SICC, Iluvatar; TrendForce releases of 7 Sep (DRAM) and 9 Sep (foundry); the broker target changes quoted.</w:t>
       </w:r>
     </w:p>
     <w:p>
@@ -11868,7 +12983,7 @@
         <w:t xml:space="preserve">Read, not verified this week: </w:t>
       </w:r>
       <w:r>
-        <w:t>the business descriptions and the cycle arguments (DDR4/NOR pricing, DDIC, SiC ASP, GaN adoption, the Hua Hong asset consolidation). They are the framework; the August interim results and the September TrendForce release are the two documents that can break them, and both should be checked against sections 2–5 before sizing up.</w:t>
+        <w:t>the Hua Hong Q3 guidance numbers and the asset-injection terms; 1H26 prints for Biren, Horizon, Black Sesame; the exact 7 Sep index constituent changes and Nexchip’s Southbound inclusion date; the cause of Iluvatar’s Monday fall; the SiC/GaN industry pricing commentary. Lock-up dates are computed as six months from listing. Annualised P/Es are 2× the first half on the 7 Sep H-share market cap.</w:t>
       </w:r>
     </w:p>
     <w:sectPr>

</xml_diff>